<commit_message>
docs: tambahkan caption Gambar 2.1, rapikan urutan Gambar Bab 3, dan lengkapi Daftar Tabel serta Daftar Gambar
</commit_message>
<xml_diff>
--- a/01_Naskah_Proposal_Master/PROPOSAL_BAB_1-3_FINAL_SEMPURNA.docx
+++ b/01_Naskah_Proposal_Master/PROPOSAL_BAB_1-3_FINAL_SEMPURNA.docx
@@ -45,6 +45,396 @@
           <w:rFonts w:cs="Times New Roman"/>
         </w:rPr>
       </w:pPr>
+    </w:p>
+    <w:p>
+      <w:pPr>
+        <w:spacing w:before="0" w:after="60" w:line="276" w:lineRule="auto"/>
+        <w:jc w:val="left"/>
+      </w:pPr>
+      <w:r>
+        <w:rPr>
+          <w:rFonts w:ascii="Times New Roman" w:hAnsi="Times New Roman"/>
+          <w:b w:val="0"/>
+          <w:i w:val="0"/>
+          <w:color w:val="000000"/>
+          <w:sz w:val="22"/>
+        </w:rPr>
+      </w:r>
+      <w:r>
+        <w:br w:type="page"/>
+      </w:r>
+    </w:p>
+    <w:p>
+      <w:pPr>
+        <w:spacing w:before="120" w:after="240" w:line="276" w:lineRule="auto"/>
+        <w:jc w:val="center"/>
+      </w:pPr>
+      <w:r>
+        <w:rPr>
+          <w:rFonts w:ascii="Times New Roman" w:hAnsi="Times New Roman"/>
+          <w:b/>
+          <w:i w:val="0"/>
+          <w:color w:val="000000"/>
+          <w:sz w:val="24"/>
+        </w:rPr>
+        <w:t>DAFTAR TABEL</w:t>
+      </w:r>
+    </w:p>
+    <w:p>
+      <w:pPr>
+        <w:spacing w:before="40" w:after="60" w:line="276" w:lineRule="auto"/>
+        <w:jc w:val="left"/>
+      </w:pPr>
+      <w:r>
+        <w:rPr>
+          <w:rFonts w:ascii="Times New Roman" w:hAnsi="Times New Roman"/>
+          <w:b w:val="0"/>
+          <w:i w:val="0"/>
+          <w:color w:val="000000"/>
+          <w:sz w:val="22"/>
+        </w:rPr>
+        <w:t>Tabel 2.1    Ringkasan Penelitian Terdahulu (State of the Art)</w:t>
+      </w:r>
+    </w:p>
+    <w:p>
+      <w:pPr>
+        <w:spacing w:before="40" w:after="60" w:line="276" w:lineRule="auto"/>
+        <w:jc w:val="left"/>
+      </w:pPr>
+      <w:r>
+        <w:rPr>
+          <w:rFonts w:ascii="Times New Roman" w:hAnsi="Times New Roman"/>
+          <w:b w:val="0"/>
+          <w:i w:val="0"/>
+          <w:color w:val="000000"/>
+          <w:sz w:val="22"/>
+        </w:rPr>
+        <w:t>Tabel 3.1    Jadwal Rencana Pelaksanaan Penelitian (Tahun Akademik 2025/2026)</w:t>
+      </w:r>
+    </w:p>
+    <w:p>
+      <w:pPr>
+        <w:spacing w:before="40" w:after="60" w:line="276" w:lineRule="auto"/>
+        <w:jc w:val="left"/>
+      </w:pPr>
+      <w:r>
+        <w:rPr>
+          <w:rFonts w:ascii="Times New Roman" w:hAnsi="Times New Roman"/>
+          <w:b w:val="0"/>
+          <w:i w:val="0"/>
+          <w:color w:val="000000"/>
+          <w:sz w:val="22"/>
+        </w:rPr>
+        <w:t>Tabel 3.2    Deskripsi Atribut dan Variabel Penelitian</w:t>
+      </w:r>
+    </w:p>
+    <w:p>
+      <w:pPr>
+        <w:spacing w:before="40" w:after="60" w:line="276" w:lineRule="auto"/>
+        <w:jc w:val="left"/>
+      </w:pPr>
+      <w:r>
+        <w:rPr>
+          <w:rFonts w:ascii="Times New Roman" w:hAnsi="Times New Roman"/>
+          <w:b w:val="0"/>
+          <w:i w:val="0"/>
+          <w:color w:val="000000"/>
+          <w:sz w:val="22"/>
+        </w:rPr>
+        <w:t>Tabel 3.3    Spesifikasi Perangkat Keras (Hardware) Penelitian</w:t>
+      </w:r>
+    </w:p>
+    <w:p>
+      <w:pPr>
+        <w:spacing w:before="40" w:after="60" w:line="276" w:lineRule="auto"/>
+        <w:jc w:val="left"/>
+      </w:pPr>
+      <w:r>
+        <w:rPr>
+          <w:rFonts w:ascii="Times New Roman" w:hAnsi="Times New Roman"/>
+          <w:b w:val="0"/>
+          <w:i w:val="0"/>
+          <w:color w:val="000000"/>
+          <w:sz w:val="22"/>
+        </w:rPr>
+        <w:t>Tabel 3.4    Spesifikasi Perangkat Lunak (Software) dan Pustaka Pemrograman</w:t>
+      </w:r>
+    </w:p>
+    <w:p>
+      <w:pPr>
+        <w:spacing w:before="40" w:after="60" w:line="276" w:lineRule="auto"/>
+        <w:jc w:val="left"/>
+      </w:pPr>
+      <w:r>
+        <w:rPr>
+          <w:rFonts w:ascii="Times New Roman" w:hAnsi="Times New Roman"/>
+          <w:b w:val="0"/>
+          <w:i w:val="0"/>
+          <w:color w:val="000000"/>
+          <w:sz w:val="22"/>
+        </w:rPr>
+        <w:t>Tabel 3.5    Distribusi Sebaran Kelas Target Sleep Disorder Risk</w:t>
+      </w:r>
+    </w:p>
+    <w:p>
+      <w:pPr>
+        <w:spacing w:before="40" w:after="60" w:line="276" w:lineRule="auto"/>
+        <w:jc w:val="left"/>
+      </w:pPr>
+      <w:r>
+        <w:rPr>
+          <w:rFonts w:ascii="Times New Roman" w:hAnsi="Times New Roman"/>
+          <w:b w:val="0"/>
+          <w:i w:val="0"/>
+          <w:color w:val="000000"/>
+          <w:sz w:val="22"/>
+        </w:rPr>
+        <w:t>Tabel 3.6    Konfigurasi Hyperparameter Algoritma CatBoost</w:t>
+      </w:r>
+    </w:p>
+    <w:p>
+      <w:pPr>
+        <w:spacing w:before="40" w:after="60" w:line="276" w:lineRule="auto"/>
+        <w:jc w:val="left"/>
+      </w:pPr>
+      <w:r>
+        <w:rPr>
+          <w:rFonts w:ascii="Times New Roman" w:hAnsi="Times New Roman"/>
+          <w:b w:val="0"/>
+          <w:i w:val="0"/>
+          <w:color w:val="000000"/>
+          <w:sz w:val="22"/>
+        </w:rPr>
+        <w:t>Tabel 3.7    Komparasi Perhitungan Bobot Penalti Kelas Manual vs Internal Pustaka CatBoost</w:t>
+      </w:r>
+    </w:p>
+    <w:p>
+      <w:pPr>
+        <w:spacing w:before="40" w:after="60" w:line="276" w:lineRule="auto"/>
+        <w:jc w:val="left"/>
+      </w:pPr>
+      <w:r>
+        <w:rPr>
+          <w:rFonts w:ascii="Times New Roman" w:hAnsi="Times New Roman"/>
+          <w:b w:val="0"/>
+          <w:i w:val="0"/>
+          <w:color w:val="000000"/>
+          <w:sz w:val="22"/>
+        </w:rPr>
+        <w:t>Tabel 3.8    Sampel Data Kecil (Toy Dataset 5 Baris) dan Langkah Transformasi Ordered Target Statistics</w:t>
+      </w:r>
+    </w:p>
+    <w:p>
+      <w:pPr>
+        <w:spacing w:before="40" w:after="60" w:line="276" w:lineRule="auto"/>
+        <w:jc w:val="left"/>
+      </w:pPr>
+      <w:r>
+        <w:rPr>
+          <w:rFonts w:ascii="Times New Roman" w:hAnsi="Times New Roman"/>
+          <w:b w:val="0"/>
+          <w:i w:val="0"/>
+          <w:color w:val="000000"/>
+          <w:sz w:val="22"/>
+        </w:rPr>
+        <w:t>Tabel 3.9    Simulasi Matriks Kebingungan 4x4 (Data Uji Awal) dan Pembuktian Manual Formula Metrik Evaluasi</w:t>
+      </w:r>
+    </w:p>
+    <w:p>
+      <w:pPr>
+        <w:spacing w:before="40" w:after="60" w:line="276" w:lineRule="auto"/>
+        <w:jc w:val="left"/>
+      </w:pPr>
+      <w:r>
+        <w:rPr>
+          <w:rFonts w:ascii="Times New Roman" w:hAnsi="Times New Roman"/>
+          <w:b w:val="0"/>
+          <w:i w:val="0"/>
+          <w:color w:val="000000"/>
+          <w:sz w:val="22"/>
+        </w:rPr>
+        <w:t>Tabel 3.10   Pembuktian Aksioma Aditivitas Efisiensi SHAP pada Satu Rekaman Profil Pasien Uji</w:t>
+      </w:r>
+    </w:p>
+    <w:p>
+      <w:pPr>
+        <w:spacing w:before="40" w:after="60" w:line="276" w:lineRule="auto"/>
+        <w:jc w:val="left"/>
+      </w:pPr>
+      <w:r>
+        <w:rPr>
+          <w:rFonts w:ascii="Times New Roman" w:hAnsi="Times New Roman"/>
+          <w:b w:val="0"/>
+          <w:i w:val="0"/>
+          <w:color w:val="000000"/>
+          <w:sz w:val="22"/>
+        </w:rPr>
+        <w:t>Tabel 3.11   Struktur Teoretis Matriks Kebingungan (Multi-Class Confusion Matrix) 4x4</w:t>
+      </w:r>
+    </w:p>
+    <w:p>
+      <w:pPr>
+        <w:spacing w:before="0" w:after="60" w:line="276" w:lineRule="auto"/>
+        <w:jc w:val="left"/>
+      </w:pPr>
+      <w:r>
+        <w:rPr>
+          <w:rFonts w:ascii="Times New Roman" w:hAnsi="Times New Roman"/>
+          <w:b w:val="0"/>
+          <w:i w:val="0"/>
+          <w:color w:val="000000"/>
+          <w:sz w:val="22"/>
+        </w:rPr>
+      </w:r>
+      <w:r>
+        <w:br w:type="page"/>
+      </w:r>
+    </w:p>
+    <w:p>
+      <w:pPr>
+        <w:spacing w:before="120" w:after="240" w:line="276" w:lineRule="auto"/>
+        <w:jc w:val="center"/>
+      </w:pPr>
+      <w:r>
+        <w:rPr>
+          <w:rFonts w:ascii="Times New Roman" w:hAnsi="Times New Roman"/>
+          <w:b/>
+          <w:i w:val="0"/>
+          <w:color w:val="000000"/>
+          <w:sz w:val="24"/>
+        </w:rPr>
+        <w:t>DAFTAR GAMBAR</w:t>
+      </w:r>
+    </w:p>
+    <w:p>
+      <w:pPr>
+        <w:spacing w:before="40" w:after="60" w:line="276" w:lineRule="auto"/>
+        <w:jc w:val="left"/>
+      </w:pPr>
+      <w:r>
+        <w:rPr>
+          <w:rFonts w:ascii="Times New Roman" w:hAnsi="Times New Roman"/>
+          <w:b w:val="0"/>
+          <w:i w:val="0"/>
+          <w:color w:val="000000"/>
+          <w:sz w:val="22"/>
+        </w:rPr>
+        <w:t>Gambar 2.1    Bagan Kerangka Berpikir Integrasi CatBoost dan Tree-SHAP untuk Deteksi Risiko Gangguan Tidur</w:t>
+      </w:r>
+    </w:p>
+    <w:p>
+      <w:pPr>
+        <w:spacing w:before="40" w:after="60" w:line="276" w:lineRule="auto"/>
+        <w:jc w:val="left"/>
+      </w:pPr>
+      <w:r>
+        <w:rPr>
+          <w:rFonts w:ascii="Times New Roman" w:hAnsi="Times New Roman"/>
+          <w:b w:val="0"/>
+          <w:i w:val="0"/>
+          <w:color w:val="000000"/>
+          <w:sz w:val="22"/>
+        </w:rPr>
+        <w:t>Gambar 3.1    Diagram Alir Kerangka Kerja CRISP-DM dalam Klasifikasi Gangguan Tidur dan XAI-SHAP</w:t>
+      </w:r>
+    </w:p>
+    <w:p>
+      <w:pPr>
+        <w:spacing w:before="40" w:after="60" w:line="276" w:lineRule="auto"/>
+        <w:jc w:val="left"/>
+      </w:pPr>
+      <w:r>
+        <w:rPr>
+          <w:rFonts w:ascii="Times New Roman" w:hAnsi="Times New Roman"/>
+          <w:b w:val="0"/>
+          <w:i w:val="0"/>
+          <w:color w:val="000000"/>
+          <w:sz w:val="22"/>
+        </w:rPr>
+        <w:t>Gambar 3.2    Grafik Sebaran Ketidakseimbangan Kelas Target (Dataset 100.000 Baris)</w:t>
+      </w:r>
+    </w:p>
+    <w:p>
+      <w:pPr>
+        <w:spacing w:before="40" w:after="60" w:line="276" w:lineRule="auto"/>
+        <w:jc w:val="left"/>
+      </w:pPr>
+      <w:r>
+        <w:rPr>
+          <w:rFonts w:ascii="Times New Roman" w:hAnsi="Times New Roman"/>
+          <w:b w:val="0"/>
+          <w:i w:val="0"/>
+          <w:color w:val="000000"/>
+          <w:sz w:val="22"/>
+        </w:rPr>
+        <w:t>Gambar 3.3    Diagram Alir Simulasi Perhitungan Matematis Manual (Toy Example Workflow) pada Algoritma CatBoost dan XAI-SHAP</w:t>
+      </w:r>
+    </w:p>
+    <w:p>
+      <w:pPr>
+        <w:spacing w:before="40" w:after="60" w:line="276" w:lineRule="auto"/>
+        <w:jc w:val="left"/>
+      </w:pPr>
+      <w:r>
+        <w:rPr>
+          <w:rFonts w:ascii="Times New Roman" w:hAnsi="Times New Roman"/>
+          <w:b w:val="0"/>
+          <w:i w:val="0"/>
+          <w:color w:val="000000"/>
+          <w:sz w:val="22"/>
+        </w:rPr>
+        <w:t>Gambar 3.4    Visualisasi Bobot Penalti Kelas dan Simulasi Matriks Kebingungan (Confusion Matrix) 4x4</w:t>
+      </w:r>
+    </w:p>
+    <w:p>
+      <w:pPr>
+        <w:spacing w:before="40" w:after="60" w:line="276" w:lineRule="auto"/>
+        <w:jc w:val="left"/>
+      </w:pPr>
+      <w:r>
+        <w:rPr>
+          <w:rFonts w:ascii="Times New Roman" w:hAnsi="Times New Roman"/>
+          <w:b w:val="0"/>
+          <w:i w:val="0"/>
+          <w:color w:val="000000"/>
+          <w:sz w:val="22"/>
+        </w:rPr>
+        <w:t>Gambar 3.5    Alur Komputasi dan Interpretasi XAI Tree-SHAP</w:t>
+      </w:r>
+    </w:p>
+    <w:p>
+      <w:pPr>
+        <w:spacing w:before="40" w:after="60" w:line="276" w:lineRule="auto"/>
+        <w:jc w:val="left"/>
+      </w:pPr>
+      <w:r>
+        <w:rPr>
+          <w:rFonts w:ascii="Times New Roman" w:hAnsi="Times New Roman"/>
+          <w:b w:val="0"/>
+          <w:i w:val="0"/>
+          <w:color w:val="000000"/>
+          <w:sz w:val="22"/>
+        </w:rPr>
+        <w:t>Gambar 3.6    Mockup Antarmuka Prototipe Web CDSS Analisis Gangguan Tidur Berbasis CatBoost-SHAP</w:t>
+      </w:r>
+    </w:p>
+    <w:p>
+      <w:pPr>
+        <w:spacing w:before="0" w:after="60" w:line="276" w:lineRule="auto"/>
+        <w:jc w:val="left"/>
+      </w:pPr>
+      <w:r>
+        <w:rPr>
+          <w:rFonts w:ascii="Times New Roman" w:hAnsi="Times New Roman"/>
+          <w:b w:val="0"/>
+          <w:i w:val="0"/>
+          <w:color w:val="000000"/>
+          <w:sz w:val="22"/>
+        </w:rPr>
+      </w:r>
+      <w:r>
+        <w:br w:type="page"/>
+      </w:r>
     </w:p>
     <w:p>
       <w:pPr>
@@ -1453,13 +1843,19 @@
       <w:pPr>
         <w:spacing w:after="120"/>
         <w:ind w:firstLine="576"/>
+      </w:pPr>
+      <w:r>
+        <w:t>Untuk menjembatani kesenjangan antara kebutuhan data kategorikal yang utuh dan transparansi inferensi klinis, kombinasi algoritma CatBoost dan SHAP mulai dieksplorasi dalam penelitian medis. Das et al. (2025) membuktikan keunggulan CatBoost dalam memprediksi insomnia, namun kajian tersebut masih terbatas pada klasifikasi biner pasien komorbid rumah sakit dengan visualisasi SHAP global. Di ranah onkologi, Srinivasu et al. (2024) mengintegrasikan CatBoost dan SHAP hingga meraih akurasi 99,3% dengan eksplanasi fitur yang jelas. Validasi keunggulan CatBoost atas data tabular medis juga diperkuat oleh Wolak et al. (2025). Meskipun demikian, penerapan sinergi CatBoost dan Tree-SHAP belum pernah dieksplorasi secara terpadu pada metrik gaya hidup digital untuk klasifikasi risiko multi-kelas. Mengisi celah riset inilah yang menjadi posisi kebaruan (novelty) utama penelitian ini, yakni menghadirkan sistem deteksi risiko yang akurat, transparan, dan dapat ditindaklanjuti.</w:t>
+      </w:r>
+    </w:p>
+    <w:p>
+      <w:pPr>
+        <w:spacing w:after="120"/>
+        <w:ind w:firstLine="576"/>
         <w:rPr>
           <w:rFonts w:cs="Times New Roman"/>
         </w:rPr>
       </w:pPr>
-      <w:r>
-        <w:t>Untuk menjembatani kesenjangan antara kebutuhan data kategorikal yang utuh dan transparansi inferensi klinis, kombinasi algoritma CatBoost dan SHAP mulai dieksplorasi dalam penelitian medis. Das et al. (2025) membuktikan keunggulan CatBoost dalam memprediksi insomnia, namun kajian tersebut masih terbatas pada klasifikasi biner pasien komorbid rumah sakit dengan visualisasi SHAP global. Di ranah onkologi, Srinivasu et al. (2024) mengintegrasikan CatBoost dan SHAP hingga meraih akurasi 99,3% dengan eksplanasi fitur yang jelas. Validasi keunggulan CatBoost atas data tabular medis juga diperkuat oleh Wolak et al. (2025). Meskipun demikian, penerapan sinergi CatBoost dan Tree-SHAP belum pernah dieksplorasi secara terpadu pada metrik gaya hidup digital untuk klasifikasi risiko multi-kelas. Mengisi celah riset inilah yang menjadi posisi kebaruan (novelty) utama penelitian ini, yakni menghadirkan sistem deteksi risiko yang akurat, transparan, dan dapat ditindaklanjuti.</w:t>
-      </w:r>
     </w:p>
     <w:p>
       <w:pPr>
@@ -1480,54 +1876,47 @@
           <w:b/>
           <w:sz w:val="22"/>
         </w:rPr>
+        <w:lastRenderedPageBreak/>
         <w:t>Tabel 2.1 Ringkasan Penelitian Terdahulu (State of the Art)</w:t>
       </w:r>
     </w:p>
     <w:tbl>
       <w:tblPr>
-        <w:tblW w:type="auto" w:w="0"/>
-        <w:jc w:val="center"/>
-        <w:tblLook w:firstColumn="1" w:firstRow="1" w:lastColumn="0" w:lastRow="0" w:noHBand="0" w:noVBand="1" w:val="04A0"/>
-        <w:tblBorders>
-          <w:top w:val="single" w:sz="4" w:space="0" w:color="CCCCCC"/>
-          <w:bottom w:val="single" w:sz="4" w:space="0" w:color="CCCCCC"/>
-          <w:insideH w:val="single" w:sz="4" w:space="0" w:color="CCCCCC"/>
-          <w:left w:val="none"/>
-          <w:right w:val="none"/>
-          <w:insideV w:val="none"/>
-        </w:tblBorders>
+        <w:tblStyle w:val="TableGridLight"/>
+        <w:tblW w:w="0" w:type="auto"/>
+        <w:tblLook w:val="04A0" w:firstRow="1" w:lastRow="0" w:firstColumn="1" w:lastColumn="0" w:noHBand="0" w:noVBand="1"/>
       </w:tblPr>
       <w:tblGrid>
-        <w:gridCol w:w="882"/>
-        <w:gridCol w:w="882"/>
-        <w:gridCol w:w="882"/>
-        <w:gridCol w:w="882"/>
-        <w:gridCol w:w="882"/>
-        <w:gridCol w:w="882"/>
-        <w:gridCol w:w="882"/>
-        <w:gridCol w:w="882"/>
-        <w:gridCol w:w="882"/>
+        <w:gridCol w:w="367"/>
+        <w:gridCol w:w="714"/>
+        <w:gridCol w:w="1015"/>
+        <w:gridCol w:w="890"/>
+        <w:gridCol w:w="792"/>
+        <w:gridCol w:w="775"/>
+        <w:gridCol w:w="1041"/>
+        <w:gridCol w:w="1150"/>
+        <w:gridCol w:w="1183"/>
       </w:tblGrid>
       <w:tr>
         <w:tc>
           <w:tcPr>
-            <w:tcW w:type="dxa" w:w="882"/>
-            <w:shd w:val="clear" w:color="auto" w:fill="F2F4F7"/>
-            <w:vAlign w:val="top"/>
+            <w:tcW w:w="882" w:type="dxa"/>
           </w:tcPr>
           <w:p>
             <w:pPr>
               <w:spacing w:before="40" w:after="40" w:line="252" w:lineRule="auto"/>
               <w:jc w:val="center"/>
-            </w:pPr>
-            <w:r/>
-            <w:r>
-              <w:rPr>
-                <w:rFonts w:ascii="Times New Roman" w:hAnsi="Times New Roman"/>
+              <w:rPr>
+                <w:sz w:val="16"/>
+                <w:szCs w:val="16"/>
+              </w:rPr>
+            </w:pPr>
+            <w:r>
+              <w:rPr>
                 <w:b/>
-                <w:i w:val="0"/>
-                <w:color w:val="000000"/>
-                <w:sz w:val="18"/>
+                <w:color w:val="000000"/>
+                <w:sz w:val="16"/>
+                <w:szCs w:val="16"/>
               </w:rPr>
               <w:t>No</w:t>
             </w:r>
@@ -1535,23 +1924,23 @@
         </w:tc>
         <w:tc>
           <w:tcPr>
-            <w:tcW w:type="dxa" w:w="882"/>
-            <w:shd w:val="clear" w:color="auto" w:fill="F2F4F7"/>
-            <w:vAlign w:val="top"/>
+            <w:tcW w:w="882" w:type="dxa"/>
           </w:tcPr>
           <w:p>
             <w:pPr>
               <w:spacing w:before="40" w:after="40" w:line="252" w:lineRule="auto"/>
               <w:jc w:val="center"/>
-            </w:pPr>
-            <w:r/>
-            <w:r>
-              <w:rPr>
-                <w:rFonts w:ascii="Times New Roman" w:hAnsi="Times New Roman"/>
+              <w:rPr>
+                <w:sz w:val="16"/>
+                <w:szCs w:val="16"/>
+              </w:rPr>
+            </w:pPr>
+            <w:r>
+              <w:rPr>
                 <w:b/>
-                <w:i w:val="0"/>
-                <w:color w:val="000000"/>
-                <w:sz w:val="18"/>
+                <w:color w:val="000000"/>
+                <w:sz w:val="16"/>
+                <w:szCs w:val="16"/>
               </w:rPr>
               <w:t>Peneliti (Tahun)</w:t>
             </w:r>
@@ -1559,23 +1948,23 @@
         </w:tc>
         <w:tc>
           <w:tcPr>
-            <w:tcW w:type="dxa" w:w="882"/>
-            <w:shd w:val="clear" w:color="auto" w:fill="F2F4F7"/>
-            <w:vAlign w:val="top"/>
+            <w:tcW w:w="882" w:type="dxa"/>
           </w:tcPr>
           <w:p>
             <w:pPr>
               <w:spacing w:before="40" w:after="40" w:line="252" w:lineRule="auto"/>
               <w:jc w:val="center"/>
-            </w:pPr>
-            <w:r/>
-            <w:r>
-              <w:rPr>
-                <w:rFonts w:ascii="Times New Roman" w:hAnsi="Times New Roman"/>
+              <w:rPr>
+                <w:sz w:val="16"/>
+                <w:szCs w:val="16"/>
+              </w:rPr>
+            </w:pPr>
+            <w:r>
+              <w:rPr>
                 <w:b/>
-                <w:i w:val="0"/>
-                <w:color w:val="000000"/>
-                <w:sz w:val="18"/>
+                <w:color w:val="000000"/>
+                <w:sz w:val="16"/>
+                <w:szCs w:val="16"/>
               </w:rPr>
               <w:t>Judul Artikel</w:t>
             </w:r>
@@ -1583,23 +1972,23 @@
         </w:tc>
         <w:tc>
           <w:tcPr>
-            <w:tcW w:type="dxa" w:w="882"/>
-            <w:shd w:val="clear" w:color="auto" w:fill="F2F4F7"/>
-            <w:vAlign w:val="top"/>
+            <w:tcW w:w="882" w:type="dxa"/>
           </w:tcPr>
           <w:p>
             <w:pPr>
               <w:spacing w:before="40" w:after="40" w:line="252" w:lineRule="auto"/>
               <w:jc w:val="center"/>
-            </w:pPr>
-            <w:r/>
-            <w:r>
-              <w:rPr>
-                <w:rFonts w:ascii="Times New Roman" w:hAnsi="Times New Roman"/>
+              <w:rPr>
+                <w:sz w:val="16"/>
+                <w:szCs w:val="16"/>
+              </w:rPr>
+            </w:pPr>
+            <w:r>
+              <w:rPr>
                 <w:b/>
-                <w:i w:val="0"/>
-                <w:color w:val="000000"/>
-                <w:sz w:val="18"/>
+                <w:color w:val="000000"/>
+                <w:sz w:val="16"/>
+                <w:szCs w:val="16"/>
               </w:rPr>
               <w:t>Dataset yang Digunakan</w:t>
             </w:r>
@@ -1607,23 +1996,23 @@
         </w:tc>
         <w:tc>
           <w:tcPr>
-            <w:tcW w:type="dxa" w:w="882"/>
-            <w:shd w:val="clear" w:color="auto" w:fill="F2F4F7"/>
-            <w:vAlign w:val="top"/>
+            <w:tcW w:w="882" w:type="dxa"/>
           </w:tcPr>
           <w:p>
             <w:pPr>
               <w:spacing w:before="40" w:after="40" w:line="252" w:lineRule="auto"/>
               <w:jc w:val="center"/>
-            </w:pPr>
-            <w:r/>
-            <w:r>
-              <w:rPr>
-                <w:rFonts w:ascii="Times New Roman" w:hAnsi="Times New Roman"/>
+              <w:rPr>
+                <w:sz w:val="16"/>
+                <w:szCs w:val="16"/>
+              </w:rPr>
+            </w:pPr>
+            <w:r>
+              <w:rPr>
                 <w:b/>
-                <w:i w:val="0"/>
-                <w:color w:val="000000"/>
-                <w:sz w:val="18"/>
+                <w:color w:val="000000"/>
+                <w:sz w:val="16"/>
+                <w:szCs w:val="16"/>
               </w:rPr>
               <w:t>Algoritma dan Metode</w:t>
             </w:r>
@@ -1631,23 +2020,23 @@
         </w:tc>
         <w:tc>
           <w:tcPr>
-            <w:tcW w:type="dxa" w:w="882"/>
-            <w:shd w:val="clear" w:color="auto" w:fill="F2F4F7"/>
-            <w:vAlign w:val="top"/>
+            <w:tcW w:w="882" w:type="dxa"/>
           </w:tcPr>
           <w:p>
             <w:pPr>
               <w:spacing w:before="40" w:after="40" w:line="252" w:lineRule="auto"/>
               <w:jc w:val="center"/>
-            </w:pPr>
-            <w:r/>
-            <w:r>
-              <w:rPr>
-                <w:rFonts w:ascii="Times New Roman" w:hAnsi="Times New Roman"/>
+              <w:rPr>
+                <w:sz w:val="16"/>
+                <w:szCs w:val="16"/>
+              </w:rPr>
+            </w:pPr>
+            <w:r>
+              <w:rPr>
                 <w:b/>
-                <w:i w:val="0"/>
-                <w:color w:val="000000"/>
-                <w:sz w:val="18"/>
+                <w:color w:val="000000"/>
+                <w:sz w:val="16"/>
+                <w:szCs w:val="16"/>
               </w:rPr>
               <w:t>Metrik</w:t>
             </w:r>
@@ -1655,23 +2044,23 @@
         </w:tc>
         <w:tc>
           <w:tcPr>
-            <w:tcW w:type="dxa" w:w="882"/>
-            <w:shd w:val="clear" w:color="auto" w:fill="F2F4F7"/>
-            <w:vAlign w:val="top"/>
+            <w:tcW w:w="882" w:type="dxa"/>
           </w:tcPr>
           <w:p>
             <w:pPr>
               <w:spacing w:before="40" w:after="40" w:line="252" w:lineRule="auto"/>
               <w:jc w:val="center"/>
-            </w:pPr>
-            <w:r/>
-            <w:r>
-              <w:rPr>
-                <w:rFonts w:ascii="Times New Roman" w:hAnsi="Times New Roman"/>
+              <w:rPr>
+                <w:sz w:val="16"/>
+                <w:szCs w:val="16"/>
+              </w:rPr>
+            </w:pPr>
+            <w:r>
+              <w:rPr>
                 <w:b/>
-                <w:i w:val="0"/>
-                <w:color w:val="000000"/>
-                <w:sz w:val="18"/>
+                <w:color w:val="000000"/>
+                <w:sz w:val="16"/>
+                <w:szCs w:val="16"/>
               </w:rPr>
               <w:t>Hasil</w:t>
             </w:r>
@@ -1679,23 +2068,23 @@
         </w:tc>
         <w:tc>
           <w:tcPr>
-            <w:tcW w:type="dxa" w:w="882"/>
-            <w:shd w:val="clear" w:color="auto" w:fill="F2F4F7"/>
-            <w:vAlign w:val="top"/>
+            <w:tcW w:w="882" w:type="dxa"/>
           </w:tcPr>
           <w:p>
             <w:pPr>
               <w:spacing w:before="40" w:after="40" w:line="252" w:lineRule="auto"/>
               <w:jc w:val="center"/>
-            </w:pPr>
-            <w:r/>
-            <w:r>
-              <w:rPr>
-                <w:rFonts w:ascii="Times New Roman" w:hAnsi="Times New Roman"/>
+              <w:rPr>
+                <w:sz w:val="16"/>
+                <w:szCs w:val="16"/>
+              </w:rPr>
+            </w:pPr>
+            <w:r>
+              <w:rPr>
                 <w:b/>
-                <w:i w:val="0"/>
-                <w:color w:val="000000"/>
-                <w:sz w:val="18"/>
+                <w:color w:val="000000"/>
+                <w:sz w:val="16"/>
+                <w:szCs w:val="16"/>
               </w:rPr>
               <w:t>Celah (Research Gap)</w:t>
             </w:r>
@@ -1703,23 +2092,23 @@
         </w:tc>
         <w:tc>
           <w:tcPr>
-            <w:tcW w:type="dxa" w:w="882"/>
-            <w:shd w:val="clear" w:color="auto" w:fill="F2F4F7"/>
-            <w:vAlign w:val="top"/>
+            <w:tcW w:w="882" w:type="dxa"/>
           </w:tcPr>
           <w:p>
             <w:pPr>
               <w:spacing w:before="40" w:after="40" w:line="252" w:lineRule="auto"/>
               <w:jc w:val="center"/>
-            </w:pPr>
-            <w:r/>
-            <w:r>
-              <w:rPr>
-                <w:rFonts w:ascii="Times New Roman" w:hAnsi="Times New Roman"/>
+              <w:rPr>
+                <w:sz w:val="16"/>
+                <w:szCs w:val="16"/>
+              </w:rPr>
+            </w:pPr>
+            <w:r>
+              <w:rPr>
                 <w:b/>
-                <w:i w:val="0"/>
-                <w:color w:val="000000"/>
-                <w:sz w:val="18"/>
+                <w:color w:val="000000"/>
+                <w:sz w:val="16"/>
+                <w:szCs w:val="16"/>
               </w:rPr>
               <w:t>Masalah yang Diselesaikan oleh Skripsi Ini</w:t>
             </w:r>
@@ -1729,22 +2118,22 @@
       <w:tr>
         <w:tc>
           <w:tcPr>
-            <w:tcW w:type="dxa" w:w="882"/>
-            <w:vAlign w:val="top"/>
+            <w:tcW w:w="882" w:type="dxa"/>
           </w:tcPr>
           <w:p>
             <w:pPr>
               <w:spacing w:before="40" w:after="40" w:line="252" w:lineRule="auto"/>
               <w:jc w:val="center"/>
-            </w:pPr>
-            <w:r/>
-            <w:r>
-              <w:rPr>
-                <w:rFonts w:ascii="Times New Roman" w:hAnsi="Times New Roman"/>
-                <w:b w:val="0"/>
-                <w:i w:val="0"/>
-                <w:color w:val="000000"/>
-                <w:sz w:val="17"/>
+              <w:rPr>
+                <w:sz w:val="16"/>
+                <w:szCs w:val="16"/>
+              </w:rPr>
+            </w:pPr>
+            <w:r>
+              <w:rPr>
+                <w:color w:val="000000"/>
+                <w:sz w:val="16"/>
+                <w:szCs w:val="16"/>
               </w:rPr>
               <w:t>1</w:t>
             </w:r>
@@ -1752,22 +2141,23 @@
         </w:tc>
         <w:tc>
           <w:tcPr>
-            <w:tcW w:type="dxa" w:w="882"/>
-            <w:vAlign w:val="top"/>
+            <w:tcW w:w="882" w:type="dxa"/>
           </w:tcPr>
           <w:p>
             <w:pPr>
               <w:spacing w:before="40" w:after="40" w:line="252" w:lineRule="auto"/>
               <w:jc w:val="left"/>
-            </w:pPr>
-            <w:r/>
-            <w:r>
-              <w:rPr>
-                <w:rFonts w:ascii="Times New Roman" w:hAnsi="Times New Roman"/>
+              <w:rPr>
+                <w:sz w:val="16"/>
+                <w:szCs w:val="16"/>
+              </w:rPr>
+            </w:pPr>
+            <w:r>
+              <w:rPr>
                 <w:b/>
-                <w:i w:val="0"/>
-                <w:color w:val="000000"/>
-                <w:sz w:val="17"/>
+                <w:color w:val="000000"/>
+                <w:sz w:val="16"/>
+                <w:szCs w:val="16"/>
               </w:rPr>
               <w:t>Taher &amp; Ayon (2024)</w:t>
             </w:r>
@@ -1775,22 +2165,23 @@
         </w:tc>
         <w:tc>
           <w:tcPr>
-            <w:tcW w:type="dxa" w:w="882"/>
-            <w:vAlign w:val="top"/>
+            <w:tcW w:w="882" w:type="dxa"/>
           </w:tcPr>
           <w:p>
             <w:pPr>
               <w:spacing w:before="40" w:after="40" w:line="252" w:lineRule="auto"/>
               <w:jc w:val="left"/>
-            </w:pPr>
-            <w:r/>
-            <w:r>
-              <w:rPr>
-                <w:rFonts w:ascii="Times New Roman" w:hAnsi="Times New Roman"/>
-                <w:b w:val="0"/>
+              <w:rPr>
+                <w:sz w:val="16"/>
+                <w:szCs w:val="16"/>
+              </w:rPr>
+            </w:pPr>
+            <w:r>
+              <w:rPr>
                 <w:i/>
                 <w:color w:val="000000"/>
-                <w:sz w:val="17"/>
+                <w:sz w:val="16"/>
+                <w:szCs w:val="16"/>
               </w:rPr>
               <w:t>Exploring Sleep Disorders: A Comparative Analysis of Machine Learning Algorithms on Sleep Health and Lifestyle Data</w:t>
             </w:r>
@@ -1798,22 +2189,22 @@
         </w:tc>
         <w:tc>
           <w:tcPr>
-            <w:tcW w:type="dxa" w:w="882"/>
-            <w:vAlign w:val="top"/>
+            <w:tcW w:w="882" w:type="dxa"/>
           </w:tcPr>
           <w:p>
             <w:pPr>
               <w:spacing w:before="40" w:after="40" w:line="252" w:lineRule="auto"/>
               <w:jc w:val="left"/>
-            </w:pPr>
-            <w:r/>
-            <w:r>
-              <w:rPr>
-                <w:rFonts w:ascii="Times New Roman" w:hAnsi="Times New Roman"/>
-                <w:b w:val="0"/>
-                <w:i w:val="0"/>
-                <w:color w:val="000000"/>
-                <w:sz w:val="17"/>
+              <w:rPr>
+                <w:sz w:val="16"/>
+                <w:szCs w:val="16"/>
+              </w:rPr>
+            </w:pPr>
+            <w:r>
+              <w:rPr>
+                <w:color w:val="000000"/>
+                <w:sz w:val="16"/>
+                <w:szCs w:val="16"/>
               </w:rPr>
               <w:t>Sleep Health and Lifestyle Dataset (374 instans, 13 fitur demografi dan gaya hidup)</w:t>
             </w:r>
@@ -1821,22 +2212,22 @@
         </w:tc>
         <w:tc>
           <w:tcPr>
-            <w:tcW w:type="dxa" w:w="882"/>
-            <w:vAlign w:val="top"/>
+            <w:tcW w:w="882" w:type="dxa"/>
           </w:tcPr>
           <w:p>
             <w:pPr>
               <w:spacing w:before="40" w:after="40" w:line="252" w:lineRule="auto"/>
               <w:jc w:val="left"/>
-            </w:pPr>
-            <w:r/>
-            <w:r>
-              <w:rPr>
-                <w:rFonts w:ascii="Times New Roman" w:hAnsi="Times New Roman"/>
-                <w:b w:val="0"/>
-                <w:i w:val="0"/>
-                <w:color w:val="000000"/>
-                <w:sz w:val="17"/>
+              <w:rPr>
+                <w:sz w:val="16"/>
+                <w:szCs w:val="16"/>
+              </w:rPr>
+            </w:pPr>
+            <w:r>
+              <w:rPr>
+                <w:color w:val="000000"/>
+                <w:sz w:val="16"/>
+                <w:szCs w:val="16"/>
               </w:rPr>
               <w:t>Random Forest, AdaBoost, Logistic Regression, Gradient Boosting Machine (GBM)</w:t>
             </w:r>
@@ -1844,22 +2235,22 @@
         </w:tc>
         <w:tc>
           <w:tcPr>
-            <w:tcW w:type="dxa" w:w="882"/>
-            <w:vAlign w:val="top"/>
+            <w:tcW w:w="882" w:type="dxa"/>
           </w:tcPr>
           <w:p>
             <w:pPr>
               <w:spacing w:before="40" w:after="40" w:line="252" w:lineRule="auto"/>
               <w:jc w:val="left"/>
-            </w:pPr>
-            <w:r/>
-            <w:r>
-              <w:rPr>
-                <w:rFonts w:ascii="Times New Roman" w:hAnsi="Times New Roman"/>
-                <w:b w:val="0"/>
-                <w:i w:val="0"/>
-                <w:color w:val="000000"/>
-                <w:sz w:val="17"/>
+              <w:rPr>
+                <w:sz w:val="16"/>
+                <w:szCs w:val="16"/>
+              </w:rPr>
+            </w:pPr>
+            <w:r>
+              <w:rPr>
+                <w:color w:val="000000"/>
+                <w:sz w:val="16"/>
+                <w:szCs w:val="16"/>
               </w:rPr>
               <w:t>Akurasi, Precision, Recall, F1-Score</w:t>
             </w:r>
@@ -1867,22 +2258,22 @@
         </w:tc>
         <w:tc>
           <w:tcPr>
-            <w:tcW w:type="dxa" w:w="882"/>
-            <w:vAlign w:val="top"/>
+            <w:tcW w:w="882" w:type="dxa"/>
           </w:tcPr>
           <w:p>
             <w:pPr>
               <w:spacing w:before="40" w:after="40" w:line="252" w:lineRule="auto"/>
               <w:jc w:val="left"/>
-            </w:pPr>
-            <w:r/>
-            <w:r>
-              <w:rPr>
-                <w:rFonts w:ascii="Times New Roman" w:hAnsi="Times New Roman"/>
-                <w:b w:val="0"/>
-                <w:i w:val="0"/>
-                <w:color w:val="000000"/>
-                <w:sz w:val="17"/>
+              <w:rPr>
+                <w:sz w:val="16"/>
+                <w:szCs w:val="16"/>
+              </w:rPr>
+            </w:pPr>
+            <w:r>
+              <w:rPr>
+                <w:color w:val="000000"/>
+                <w:sz w:val="16"/>
+                <w:szCs w:val="16"/>
               </w:rPr>
               <w:t>Gradient Boosting mencapai performa tertinggi: Akurasi 93,80%, Precision 94,10%, Recall 93,80%, dan F1-Score 93,90%.</w:t>
             </w:r>
@@ -1890,22 +2281,22 @@
         </w:tc>
         <w:tc>
           <w:tcPr>
-            <w:tcW w:type="dxa" w:w="882"/>
-            <w:vAlign w:val="top"/>
+            <w:tcW w:w="882" w:type="dxa"/>
           </w:tcPr>
           <w:p>
             <w:pPr>
               <w:spacing w:before="40" w:after="40" w:line="252" w:lineRule="auto"/>
               <w:jc w:val="left"/>
-            </w:pPr>
-            <w:r/>
-            <w:r>
-              <w:rPr>
-                <w:rFonts w:ascii="Times New Roman" w:hAnsi="Times New Roman"/>
-                <w:b w:val="0"/>
-                <w:i w:val="0"/>
-                <w:color w:val="000000"/>
-                <w:sz w:val="17"/>
+              <w:rPr>
+                <w:sz w:val="16"/>
+                <w:szCs w:val="16"/>
+              </w:rPr>
+            </w:pPr>
+            <w:r>
+              <w:rPr>
+                <w:color w:val="000000"/>
+                <w:sz w:val="16"/>
+                <w:szCs w:val="16"/>
               </w:rPr>
               <w:t>Model murni beroperasi sebagai black-box tanpa penjelasan kontribusi fitur individual, serta variabel kategorikal diubah via label encoding manual yang memicu bias ordinal buatan.</w:t>
             </w:r>
@@ -1913,22 +2304,22 @@
         </w:tc>
         <w:tc>
           <w:tcPr>
-            <w:tcW w:type="dxa" w:w="882"/>
-            <w:vAlign w:val="top"/>
+            <w:tcW w:w="882" w:type="dxa"/>
           </w:tcPr>
           <w:p>
             <w:pPr>
               <w:spacing w:before="40" w:after="40" w:line="252" w:lineRule="auto"/>
               <w:jc w:val="left"/>
-            </w:pPr>
-            <w:r/>
-            <w:r>
-              <w:rPr>
-                <w:rFonts w:ascii="Times New Roman" w:hAnsi="Times New Roman"/>
-                <w:b w:val="0"/>
-                <w:i w:val="0"/>
-                <w:color w:val="000000"/>
-                <w:sz w:val="17"/>
+              <w:rPr>
+                <w:sz w:val="16"/>
+                <w:szCs w:val="16"/>
+              </w:rPr>
+            </w:pPr>
+            <w:r>
+              <w:rPr>
+                <w:color w:val="000000"/>
+                <w:sz w:val="16"/>
+                <w:szCs w:val="16"/>
               </w:rPr>
               <w:t>Menerapkan algoritma CatBoost yang memproses fitur kategorikal secara native dan mengintegrasikan Tree-SHAP untuk membedah transparansi penyebab risiko secara personal per individu.</w:t>
             </w:r>
@@ -1938,22 +2329,22 @@
       <w:tr>
         <w:tc>
           <w:tcPr>
-            <w:tcW w:type="dxa" w:w="882"/>
-            <w:vAlign w:val="top"/>
+            <w:tcW w:w="882" w:type="dxa"/>
           </w:tcPr>
           <w:p>
             <w:pPr>
               <w:spacing w:before="40" w:after="40" w:line="252" w:lineRule="auto"/>
               <w:jc w:val="center"/>
-            </w:pPr>
-            <w:r/>
-            <w:r>
-              <w:rPr>
-                <w:rFonts w:ascii="Times New Roman" w:hAnsi="Times New Roman"/>
-                <w:b w:val="0"/>
-                <w:i w:val="0"/>
-                <w:color w:val="000000"/>
-                <w:sz w:val="17"/>
+              <w:rPr>
+                <w:sz w:val="16"/>
+                <w:szCs w:val="16"/>
+              </w:rPr>
+            </w:pPr>
+            <w:r>
+              <w:rPr>
+                <w:color w:val="000000"/>
+                <w:sz w:val="16"/>
+                <w:szCs w:val="16"/>
               </w:rPr>
               <w:t>2</w:t>
             </w:r>
@@ -1961,22 +2352,23 @@
         </w:tc>
         <w:tc>
           <w:tcPr>
-            <w:tcW w:type="dxa" w:w="882"/>
-            <w:vAlign w:val="top"/>
+            <w:tcW w:w="882" w:type="dxa"/>
           </w:tcPr>
           <w:p>
             <w:pPr>
               <w:spacing w:before="40" w:after="40" w:line="252" w:lineRule="auto"/>
               <w:jc w:val="left"/>
-            </w:pPr>
-            <w:r/>
-            <w:r>
-              <w:rPr>
-                <w:rFonts w:ascii="Times New Roman" w:hAnsi="Times New Roman"/>
+              <w:rPr>
+                <w:sz w:val="16"/>
+                <w:szCs w:val="16"/>
+              </w:rPr>
+            </w:pPr>
+            <w:r>
+              <w:rPr>
                 <w:b/>
-                <w:i w:val="0"/>
-                <w:color w:val="000000"/>
-                <w:sz w:val="17"/>
+                <w:color w:val="000000"/>
+                <w:sz w:val="16"/>
+                <w:szCs w:val="16"/>
               </w:rPr>
               <w:t>Lin et al. (2025)</w:t>
             </w:r>
@@ -1984,22 +2376,23 @@
         </w:tc>
         <w:tc>
           <w:tcPr>
-            <w:tcW w:type="dxa" w:w="882"/>
-            <w:vAlign w:val="top"/>
+            <w:tcW w:w="882" w:type="dxa"/>
           </w:tcPr>
           <w:p>
             <w:pPr>
               <w:spacing w:before="40" w:after="40" w:line="252" w:lineRule="auto"/>
               <w:jc w:val="left"/>
-            </w:pPr>
-            <w:r/>
-            <w:r>
-              <w:rPr>
-                <w:rFonts w:ascii="Times New Roman" w:hAnsi="Times New Roman"/>
-                <w:b w:val="0"/>
+              <w:rPr>
+                <w:sz w:val="16"/>
+                <w:szCs w:val="16"/>
+              </w:rPr>
+            </w:pPr>
+            <w:r>
+              <w:rPr>
                 <w:i/>
                 <w:color w:val="000000"/>
-                <w:sz w:val="17"/>
+                <w:sz w:val="16"/>
+                <w:szCs w:val="16"/>
               </w:rPr>
               <w:t>Evaluation of Sleep Quality and Influencing Factors Among Medical and Non-Medical Students Using Machine Learning Techniques in Fujian During the Public Health Emergencies</w:t>
             </w:r>
@@ -2007,22 +2400,22 @@
         </w:tc>
         <w:tc>
           <w:tcPr>
-            <w:tcW w:type="dxa" w:w="882"/>
-            <w:vAlign w:val="top"/>
+            <w:tcW w:w="882" w:type="dxa"/>
           </w:tcPr>
           <w:p>
             <w:pPr>
               <w:spacing w:before="40" w:after="40" w:line="252" w:lineRule="auto"/>
               <w:jc w:val="left"/>
-            </w:pPr>
-            <w:r/>
-            <w:r>
-              <w:rPr>
-                <w:rFonts w:ascii="Times New Roman" w:hAnsi="Times New Roman"/>
-                <w:b w:val="0"/>
-                <w:i w:val="0"/>
-                <w:color w:val="000000"/>
-                <w:sz w:val="17"/>
+              <w:rPr>
+                <w:sz w:val="16"/>
+                <w:szCs w:val="16"/>
+              </w:rPr>
+            </w:pPr>
+            <w:r>
+              <w:rPr>
+                <w:color w:val="000000"/>
+                <w:sz w:val="16"/>
+                <w:szCs w:val="16"/>
               </w:rPr>
               <w:t>Data survei kuesioner PSQI 20.645 mahasiswa di Fujian, Tiongkok</w:t>
             </w:r>
@@ -2030,22 +2423,22 @@
         </w:tc>
         <w:tc>
           <w:tcPr>
-            <w:tcW w:type="dxa" w:w="882"/>
-            <w:vAlign w:val="top"/>
+            <w:tcW w:w="882" w:type="dxa"/>
           </w:tcPr>
           <w:p>
             <w:pPr>
               <w:spacing w:before="40" w:after="40" w:line="252" w:lineRule="auto"/>
               <w:jc w:val="left"/>
-            </w:pPr>
-            <w:r/>
-            <w:r>
-              <w:rPr>
-                <w:rFonts w:ascii="Times New Roman" w:hAnsi="Times New Roman"/>
-                <w:b w:val="0"/>
-                <w:i w:val="0"/>
-                <w:color w:val="000000"/>
-                <w:sz w:val="17"/>
+              <w:rPr>
+                <w:sz w:val="16"/>
+                <w:szCs w:val="16"/>
+              </w:rPr>
+            </w:pPr>
+            <w:r>
+              <w:rPr>
+                <w:color w:val="000000"/>
+                <w:sz w:val="16"/>
+                <w:szCs w:val="16"/>
               </w:rPr>
               <w:t>Artificial Neural Network (ANN), Decision Tree, Gradient Boosting Trees, Naive Bayes</w:t>
             </w:r>
@@ -2053,22 +2446,22 @@
         </w:tc>
         <w:tc>
           <w:tcPr>
-            <w:tcW w:type="dxa" w:w="882"/>
-            <w:vAlign w:val="top"/>
+            <w:tcW w:w="882" w:type="dxa"/>
           </w:tcPr>
           <w:p>
             <w:pPr>
               <w:spacing w:before="40" w:after="40" w:line="252" w:lineRule="auto"/>
               <w:jc w:val="left"/>
-            </w:pPr>
-            <w:r/>
-            <w:r>
-              <w:rPr>
-                <w:rFonts w:ascii="Times New Roman" w:hAnsi="Times New Roman"/>
-                <w:b w:val="0"/>
-                <w:i w:val="0"/>
-                <w:color w:val="000000"/>
-                <w:sz w:val="17"/>
+              <w:rPr>
+                <w:sz w:val="16"/>
+                <w:szCs w:val="16"/>
+              </w:rPr>
+            </w:pPr>
+            <w:r>
+              <w:rPr>
+                <w:color w:val="000000"/>
+                <w:sz w:val="16"/>
+                <w:szCs w:val="16"/>
               </w:rPr>
               <w:t>Akurasi, Sensitivity, Specificity, AUC-ROC</w:t>
             </w:r>
@@ -2076,22 +2469,22 @@
         </w:tc>
         <w:tc>
           <w:tcPr>
-            <w:tcW w:type="dxa" w:w="882"/>
-            <w:vAlign w:val="top"/>
+            <w:tcW w:w="882" w:type="dxa"/>
           </w:tcPr>
           <w:p>
             <w:pPr>
               <w:spacing w:before="40" w:after="40" w:line="252" w:lineRule="auto"/>
               <w:jc w:val="left"/>
-            </w:pPr>
-            <w:r/>
-            <w:r>
-              <w:rPr>
-                <w:rFonts w:ascii="Times New Roman" w:hAnsi="Times New Roman"/>
-                <w:b w:val="0"/>
-                <w:i w:val="0"/>
-                <w:color w:val="000000"/>
-                <w:sz w:val="17"/>
+              <w:rPr>
+                <w:sz w:val="16"/>
+                <w:szCs w:val="16"/>
+              </w:rPr>
+            </w:pPr>
+            <w:r>
+              <w:rPr>
+                <w:color w:val="000000"/>
+                <w:sz w:val="16"/>
+                <w:szCs w:val="16"/>
               </w:rPr>
               <w:t>Model ensemble memetakan faktor risiko mahasiswa dengan Akurasi 86,40% dan AUC-ROC 0,891.</w:t>
             </w:r>
@@ -2099,22 +2492,22 @@
         </w:tc>
         <w:tc>
           <w:tcPr>
-            <w:tcW w:type="dxa" w:w="882"/>
-            <w:vAlign w:val="top"/>
+            <w:tcW w:w="882" w:type="dxa"/>
           </w:tcPr>
           <w:p>
             <w:pPr>
               <w:spacing w:before="40" w:after="40" w:line="252" w:lineRule="auto"/>
               <w:jc w:val="left"/>
-            </w:pPr>
-            <w:r/>
-            <w:r>
-              <w:rPr>
-                <w:rFonts w:ascii="Times New Roman" w:hAnsi="Times New Roman"/>
-                <w:b w:val="0"/>
-                <w:i w:val="0"/>
-                <w:color w:val="000000"/>
-                <w:sz w:val="17"/>
+              <w:rPr>
+                <w:sz w:val="16"/>
+                <w:szCs w:val="16"/>
+              </w:rPr>
+            </w:pPr>
+            <w:r>
+              <w:rPr>
+                <w:color w:val="000000"/>
+                <w:sz w:val="16"/>
+                <w:szCs w:val="16"/>
               </w:rPr>
               <w:t>Analisis hanya berlaku di tingkat agregat populasi (makro); tidak mampu memberikan penjelasan personal di tingkat individu (local explanation) untuk interaksi non-linier kebiasaan digital.</w:t>
             </w:r>
@@ -2122,22 +2515,22 @@
         </w:tc>
         <w:tc>
           <w:tcPr>
-            <w:tcW w:type="dxa" w:w="882"/>
-            <w:vAlign w:val="top"/>
+            <w:tcW w:w="882" w:type="dxa"/>
           </w:tcPr>
           <w:p>
             <w:pPr>
               <w:spacing w:before="40" w:after="40" w:line="252" w:lineRule="auto"/>
               <w:jc w:val="left"/>
-            </w:pPr>
-            <w:r/>
-            <w:r>
-              <w:rPr>
-                <w:rFonts w:ascii="Times New Roman" w:hAnsi="Times New Roman"/>
-                <w:b w:val="0"/>
-                <w:i w:val="0"/>
-                <w:color w:val="000000"/>
-                <w:sz w:val="17"/>
+              <w:rPr>
+                <w:sz w:val="16"/>
+                <w:szCs w:val="16"/>
+              </w:rPr>
+            </w:pPr>
+            <w:r>
+              <w:rPr>
+                <w:color w:val="000000"/>
+                <w:sz w:val="16"/>
+                <w:szCs w:val="16"/>
               </w:rPr>
               <w:t>Menganalisis interaksi non-linier fitur gaya hidup secara granular per individu menggunakan CatBoost dan visualisasi Tree-SHAP individual, bukan sekadar agregasi populasi.</w:t>
             </w:r>
@@ -2147,22 +2540,22 @@
       <w:tr>
         <w:tc>
           <w:tcPr>
-            <w:tcW w:type="dxa" w:w="882"/>
-            <w:vAlign w:val="top"/>
+            <w:tcW w:w="882" w:type="dxa"/>
           </w:tcPr>
           <w:p>
             <w:pPr>
               <w:spacing w:before="40" w:after="40" w:line="252" w:lineRule="auto"/>
               <w:jc w:val="center"/>
-            </w:pPr>
-            <w:r/>
-            <w:r>
-              <w:rPr>
-                <w:rFonts w:ascii="Times New Roman" w:hAnsi="Times New Roman"/>
-                <w:b w:val="0"/>
-                <w:i w:val="0"/>
-                <w:color w:val="000000"/>
-                <w:sz w:val="17"/>
+              <w:rPr>
+                <w:sz w:val="16"/>
+                <w:szCs w:val="16"/>
+              </w:rPr>
+            </w:pPr>
+            <w:r>
+              <w:rPr>
+                <w:color w:val="000000"/>
+                <w:sz w:val="16"/>
+                <w:szCs w:val="16"/>
               </w:rPr>
               <w:t>3</w:t>
             </w:r>
@@ -2170,22 +2563,23 @@
         </w:tc>
         <w:tc>
           <w:tcPr>
-            <w:tcW w:type="dxa" w:w="882"/>
-            <w:vAlign w:val="top"/>
+            <w:tcW w:w="882" w:type="dxa"/>
           </w:tcPr>
           <w:p>
             <w:pPr>
               <w:spacing w:before="40" w:after="40" w:line="252" w:lineRule="auto"/>
               <w:jc w:val="left"/>
-            </w:pPr>
-            <w:r/>
-            <w:r>
-              <w:rPr>
-                <w:rFonts w:ascii="Times New Roman" w:hAnsi="Times New Roman"/>
+              <w:rPr>
+                <w:sz w:val="16"/>
+                <w:szCs w:val="16"/>
+              </w:rPr>
+            </w:pPr>
+            <w:r>
+              <w:rPr>
                 <w:b/>
-                <w:i w:val="0"/>
-                <w:color w:val="000000"/>
-                <w:sz w:val="17"/>
+                <w:color w:val="000000"/>
+                <w:sz w:val="16"/>
+                <w:szCs w:val="16"/>
               </w:rPr>
               <w:t>Ha et al. (2023)</w:t>
             </w:r>
@@ -2193,22 +2587,23 @@
         </w:tc>
         <w:tc>
           <w:tcPr>
-            <w:tcW w:type="dxa" w:w="882"/>
-            <w:vAlign w:val="top"/>
+            <w:tcW w:w="882" w:type="dxa"/>
           </w:tcPr>
           <w:p>
             <w:pPr>
               <w:spacing w:before="40" w:after="40" w:line="252" w:lineRule="auto"/>
               <w:jc w:val="left"/>
-            </w:pPr>
-            <w:r/>
-            <w:r>
-              <w:rPr>
-                <w:rFonts w:ascii="Times New Roman" w:hAnsi="Times New Roman"/>
-                <w:b w:val="0"/>
+              <w:rPr>
+                <w:sz w:val="16"/>
+                <w:szCs w:val="16"/>
+              </w:rPr>
+            </w:pPr>
+            <w:r>
+              <w:rPr>
                 <w:i/>
                 <w:color w:val="000000"/>
-                <w:sz w:val="17"/>
+                <w:sz w:val="16"/>
+                <w:szCs w:val="16"/>
               </w:rPr>
               <w:t>Predicting the Risk of Sleep Disorders Using a Machine Learning–Based Simple Questionnaire: Development and Validation Study</w:t>
             </w:r>
@@ -2216,22 +2611,22 @@
         </w:tc>
         <w:tc>
           <w:tcPr>
-            <w:tcW w:type="dxa" w:w="882"/>
-            <w:vAlign w:val="top"/>
+            <w:tcW w:w="882" w:type="dxa"/>
           </w:tcPr>
           <w:p>
             <w:pPr>
               <w:spacing w:before="40" w:after="40" w:line="252" w:lineRule="auto"/>
               <w:jc w:val="left"/>
-            </w:pPr>
-            <w:r/>
-            <w:r>
-              <w:rPr>
-                <w:rFonts w:ascii="Times New Roman" w:hAnsi="Times New Roman"/>
-                <w:b w:val="0"/>
-                <w:i w:val="0"/>
-                <w:color w:val="000000"/>
-                <w:sz w:val="17"/>
+              <w:rPr>
+                <w:sz w:val="16"/>
+                <w:szCs w:val="16"/>
+              </w:rPr>
+            </w:pPr>
+            <w:r>
+              <w:rPr>
+                <w:color w:val="000000"/>
+                <w:sz w:val="16"/>
+                <w:szCs w:val="16"/>
               </w:rPr>
               <w:t>Data klinis 4.622 pasien dari 2 rumah sakit (Samsung Medical Center &amp; Ewha Womans University Medical Center)</w:t>
             </w:r>
@@ -2239,22 +2634,22 @@
         </w:tc>
         <w:tc>
           <w:tcPr>
-            <w:tcW w:type="dxa" w:w="882"/>
-            <w:vAlign w:val="top"/>
+            <w:tcW w:w="882" w:type="dxa"/>
           </w:tcPr>
           <w:p>
             <w:pPr>
               <w:spacing w:before="40" w:after="40" w:line="252" w:lineRule="auto"/>
               <w:jc w:val="left"/>
-            </w:pPr>
-            <w:r/>
-            <w:r>
-              <w:rPr>
-                <w:rFonts w:ascii="Times New Roman" w:hAnsi="Times New Roman"/>
-                <w:b w:val="0"/>
-                <w:i w:val="0"/>
-                <w:color w:val="000000"/>
-                <w:sz w:val="17"/>
+              <w:rPr>
+                <w:sz w:val="16"/>
+                <w:szCs w:val="16"/>
+              </w:rPr>
+            </w:pPr>
+            <w:r>
+              <w:rPr>
+                <w:color w:val="000000"/>
+                <w:sz w:val="16"/>
+                <w:szCs w:val="16"/>
               </w:rPr>
               <w:t>Extreme Gradient Boosting (XGBoost) dengan seleksi fitur SHAP</w:t>
             </w:r>
@@ -2262,22 +2657,22 @@
         </w:tc>
         <w:tc>
           <w:tcPr>
-            <w:tcW w:type="dxa" w:w="882"/>
-            <w:vAlign w:val="top"/>
+            <w:tcW w:w="882" w:type="dxa"/>
           </w:tcPr>
           <w:p>
             <w:pPr>
               <w:spacing w:before="40" w:after="40" w:line="252" w:lineRule="auto"/>
               <w:jc w:val="left"/>
-            </w:pPr>
-            <w:r/>
-            <w:r>
-              <w:rPr>
-                <w:rFonts w:ascii="Times New Roman" w:hAnsi="Times New Roman"/>
-                <w:b w:val="0"/>
-                <w:i w:val="0"/>
-                <w:color w:val="000000"/>
-                <w:sz w:val="17"/>
+              <w:rPr>
+                <w:sz w:val="16"/>
+                <w:szCs w:val="16"/>
+              </w:rPr>
+            </w:pPr>
+            <w:r>
+              <w:rPr>
+                <w:color w:val="000000"/>
+                <w:sz w:val="16"/>
+                <w:szCs w:val="16"/>
               </w:rPr>
               <w:t>AUROC, Sensitivity, Specificity, Brier Score</w:t>
             </w:r>
@@ -2285,45 +2680,63 @@
         </w:tc>
         <w:tc>
           <w:tcPr>
-            <w:tcW w:type="dxa" w:w="882"/>
-            <w:vAlign w:val="top"/>
+            <w:tcW w:w="882" w:type="dxa"/>
           </w:tcPr>
           <w:p>
             <w:pPr>
               <w:spacing w:before="40" w:after="40" w:line="252" w:lineRule="auto"/>
               <w:jc w:val="left"/>
-            </w:pPr>
-            <w:r/>
-            <w:r>
-              <w:rPr>
-                <w:rFonts w:ascii="Times New Roman" w:hAnsi="Times New Roman"/>
-                <w:b w:val="0"/>
-                <w:i w:val="0"/>
-                <w:color w:val="000000"/>
-                <w:sz w:val="17"/>
-              </w:rPr>
-              <w:t>AUROC &gt; 0,897 untuk ketiga gangguan tidur (OSA, COMISA, insomnia); menghasilkan kuesioner ringkas SLEEPS 9 item.</w:t>
-            </w:r>
-          </w:p>
-        </w:tc>
-        <w:tc>
-          <w:tcPr>
-            <w:tcW w:type="dxa" w:w="882"/>
-            <w:vAlign w:val="top"/>
+              <w:rPr>
+                <w:sz w:val="16"/>
+                <w:szCs w:val="16"/>
+              </w:rPr>
+            </w:pPr>
+            <w:r>
+              <w:rPr>
+                <w:color w:val="000000"/>
+                <w:sz w:val="16"/>
+                <w:szCs w:val="16"/>
+              </w:rPr>
+              <w:t xml:space="preserve">AUROC &gt; 0,897 untuk ketiga gangguan tidur (OSA, COMISA, insomnia); menghasilkan kuesioner ringkas SLEEPS 9 </w:t>
+            </w:r>
+            <w:proofErr w:type="gramStart"/>
+            <w:r>
+              <w:rPr>
+                <w:color w:val="000000"/>
+                <w:sz w:val="16"/>
+                <w:szCs w:val="16"/>
+              </w:rPr>
+              <w:t>item</w:t>
+            </w:r>
+            <w:proofErr w:type="gramEnd"/>
+            <w:r>
+              <w:rPr>
+                <w:color w:val="000000"/>
+                <w:sz w:val="16"/>
+                <w:szCs w:val="16"/>
+              </w:rPr>
+              <w:t>.</w:t>
+            </w:r>
+          </w:p>
+        </w:tc>
+        <w:tc>
+          <w:tcPr>
+            <w:tcW w:w="882" w:type="dxa"/>
           </w:tcPr>
           <w:p>
             <w:pPr>
               <w:spacing w:before="40" w:after="40" w:line="252" w:lineRule="auto"/>
               <w:jc w:val="left"/>
-            </w:pPr>
-            <w:r/>
-            <w:r>
-              <w:rPr>
-                <w:rFonts w:ascii="Times New Roman" w:hAnsi="Times New Roman"/>
-                <w:b w:val="0"/>
-                <w:i w:val="0"/>
-                <w:color w:val="000000"/>
-                <w:sz w:val="17"/>
+              <w:rPr>
+                <w:sz w:val="16"/>
+                <w:szCs w:val="16"/>
+              </w:rPr>
+            </w:pPr>
+            <w:r>
+              <w:rPr>
+                <w:color w:val="000000"/>
+                <w:sz w:val="16"/>
+                <w:szCs w:val="16"/>
               </w:rPr>
               <w:t>Memerlukan encoding manual pada XGBoost; dataset berbasis kuesioner klinis dan data antropometrik statis (bukan kebiasaan harian modifiable); SHAP hanya untuk seleksi fitur awal, bukan visualisasi real-time per pasien.</w:t>
             </w:r>
@@ -2331,22 +2744,22 @@
         </w:tc>
         <w:tc>
           <w:tcPr>
-            <w:tcW w:type="dxa" w:w="882"/>
-            <w:vAlign w:val="top"/>
+            <w:tcW w:w="882" w:type="dxa"/>
           </w:tcPr>
           <w:p>
             <w:pPr>
               <w:spacing w:before="40" w:after="40" w:line="252" w:lineRule="auto"/>
               <w:jc w:val="left"/>
-            </w:pPr>
-            <w:r/>
-            <w:r>
-              <w:rPr>
-                <w:rFonts w:ascii="Times New Roman" w:hAnsi="Times New Roman"/>
-                <w:b w:val="0"/>
-                <w:i w:val="0"/>
-                <w:color w:val="000000"/>
-                <w:sz w:val="17"/>
+              <w:rPr>
+                <w:sz w:val="16"/>
+                <w:szCs w:val="16"/>
+              </w:rPr>
+            </w:pPr>
+            <w:r>
+              <w:rPr>
+                <w:color w:val="000000"/>
+                <w:sz w:val="16"/>
+                <w:szCs w:val="16"/>
               </w:rPr>
               <w:t>Menggunakan parameter gaya hidup harian yang dapat diubah (modifiable digital lifestyle), memproses data kategorikal secara native dengan CatBoost, dan menyajikan penjelasan SHAP interaktif real-time per pasien dalam sistem CDSS.</w:t>
             </w:r>
@@ -2356,45 +2769,47 @@
       <w:tr>
         <w:tc>
           <w:tcPr>
-            <w:tcW w:type="dxa" w:w="882"/>
-            <w:vAlign w:val="top"/>
+            <w:tcW w:w="882" w:type="dxa"/>
           </w:tcPr>
           <w:p>
             <w:pPr>
               <w:spacing w:before="40" w:after="40" w:line="252" w:lineRule="auto"/>
               <w:jc w:val="center"/>
-            </w:pPr>
-            <w:r/>
-            <w:r>
-              <w:rPr>
-                <w:rFonts w:ascii="Times New Roman" w:hAnsi="Times New Roman"/>
-                <w:b w:val="0"/>
-                <w:i w:val="0"/>
-                <w:color w:val="000000"/>
-                <w:sz w:val="17"/>
-              </w:rPr>
+              <w:rPr>
+                <w:sz w:val="16"/>
+                <w:szCs w:val="16"/>
+              </w:rPr>
+            </w:pPr>
+            <w:r>
+              <w:rPr>
+                <w:color w:val="000000"/>
+                <w:sz w:val="16"/>
+                <w:szCs w:val="16"/>
+              </w:rPr>
+              <w:lastRenderedPageBreak/>
               <w:t>4</w:t>
             </w:r>
           </w:p>
         </w:tc>
         <w:tc>
           <w:tcPr>
-            <w:tcW w:type="dxa" w:w="882"/>
-            <w:vAlign w:val="top"/>
+            <w:tcW w:w="882" w:type="dxa"/>
           </w:tcPr>
           <w:p>
             <w:pPr>
               <w:spacing w:before="40" w:after="40" w:line="252" w:lineRule="auto"/>
               <w:jc w:val="left"/>
-            </w:pPr>
-            <w:r/>
-            <w:r>
-              <w:rPr>
-                <w:rFonts w:ascii="Times New Roman" w:hAnsi="Times New Roman"/>
+              <w:rPr>
+                <w:sz w:val="16"/>
+                <w:szCs w:val="16"/>
+              </w:rPr>
+            </w:pPr>
+            <w:r>
+              <w:rPr>
                 <w:b/>
-                <w:i w:val="0"/>
-                <w:color w:val="000000"/>
-                <w:sz w:val="17"/>
+                <w:color w:val="000000"/>
+                <w:sz w:val="16"/>
+                <w:szCs w:val="16"/>
               </w:rPr>
               <w:t>Xie et al. (2026)</w:t>
             </w:r>
@@ -2402,22 +2817,23 @@
         </w:tc>
         <w:tc>
           <w:tcPr>
-            <w:tcW w:type="dxa" w:w="882"/>
-            <w:vAlign w:val="top"/>
+            <w:tcW w:w="882" w:type="dxa"/>
           </w:tcPr>
           <w:p>
             <w:pPr>
               <w:spacing w:before="40" w:after="40" w:line="252" w:lineRule="auto"/>
               <w:jc w:val="left"/>
-            </w:pPr>
-            <w:r/>
-            <w:r>
-              <w:rPr>
-                <w:rFonts w:ascii="Times New Roman" w:hAnsi="Times New Roman"/>
-                <w:b w:val="0"/>
+              <w:rPr>
+                <w:sz w:val="16"/>
+                <w:szCs w:val="16"/>
+              </w:rPr>
+            </w:pPr>
+            <w:r>
+              <w:rPr>
                 <w:i/>
                 <w:color w:val="000000"/>
-                <w:sz w:val="17"/>
+                <w:sz w:val="16"/>
+                <w:szCs w:val="16"/>
               </w:rPr>
               <w:t>Identifying Influencing Factors Associated with Sleep Quality in Undergraduates Based on Partial Least Squares Regression and XGBoost</w:t>
             </w:r>
@@ -2425,22 +2841,22 @@
         </w:tc>
         <w:tc>
           <w:tcPr>
-            <w:tcW w:type="dxa" w:w="882"/>
-            <w:vAlign w:val="top"/>
+            <w:tcW w:w="882" w:type="dxa"/>
           </w:tcPr>
           <w:p>
             <w:pPr>
               <w:spacing w:before="40" w:after="40" w:line="252" w:lineRule="auto"/>
               <w:jc w:val="left"/>
-            </w:pPr>
-            <w:r/>
-            <w:r>
-              <w:rPr>
-                <w:rFonts w:ascii="Times New Roman" w:hAnsi="Times New Roman"/>
-                <w:b w:val="0"/>
-                <w:i w:val="0"/>
-                <w:color w:val="000000"/>
-                <w:sz w:val="17"/>
+              <w:rPr>
+                <w:sz w:val="16"/>
+                <w:szCs w:val="16"/>
+              </w:rPr>
+            </w:pPr>
+            <w:r>
+              <w:rPr>
+                <w:color w:val="000000"/>
+                <w:sz w:val="16"/>
+                <w:szCs w:val="16"/>
               </w:rPr>
               <w:t>Data kuesioner gaya hidup 1.842 mahasiswa sarjana</w:t>
             </w:r>
@@ -2448,22 +2864,22 @@
         </w:tc>
         <w:tc>
           <w:tcPr>
-            <w:tcW w:type="dxa" w:w="882"/>
-            <w:vAlign w:val="top"/>
+            <w:tcW w:w="882" w:type="dxa"/>
           </w:tcPr>
           <w:p>
             <w:pPr>
               <w:spacing w:before="40" w:after="40" w:line="252" w:lineRule="auto"/>
               <w:jc w:val="left"/>
-            </w:pPr>
-            <w:r/>
-            <w:r>
-              <w:rPr>
-                <w:rFonts w:ascii="Times New Roman" w:hAnsi="Times New Roman"/>
-                <w:b w:val="0"/>
-                <w:i w:val="0"/>
-                <w:color w:val="000000"/>
-                <w:sz w:val="17"/>
+              <w:rPr>
+                <w:sz w:val="16"/>
+                <w:szCs w:val="16"/>
+              </w:rPr>
+            </w:pPr>
+            <w:r>
+              <w:rPr>
+                <w:color w:val="000000"/>
+                <w:sz w:val="16"/>
+                <w:szCs w:val="16"/>
               </w:rPr>
               <w:t>Partial Least Squares Regression (PLSR) dan XGBoost</w:t>
             </w:r>
@@ -2471,22 +2887,22 @@
         </w:tc>
         <w:tc>
           <w:tcPr>
-            <w:tcW w:type="dxa" w:w="882"/>
-            <w:vAlign w:val="top"/>
+            <w:tcW w:w="882" w:type="dxa"/>
           </w:tcPr>
           <w:p>
             <w:pPr>
               <w:spacing w:before="40" w:after="40" w:line="252" w:lineRule="auto"/>
               <w:jc w:val="left"/>
-            </w:pPr>
-            <w:r/>
-            <w:r>
-              <w:rPr>
-                <w:rFonts w:ascii="Times New Roman" w:hAnsi="Times New Roman"/>
-                <w:b w:val="0"/>
-                <w:i w:val="0"/>
-                <w:color w:val="000000"/>
-                <w:sz w:val="17"/>
+              <w:rPr>
+                <w:sz w:val="16"/>
+                <w:szCs w:val="16"/>
+              </w:rPr>
+            </w:pPr>
+            <w:r>
+              <w:rPr>
+                <w:color w:val="000000"/>
+                <w:sz w:val="16"/>
+                <w:szCs w:val="16"/>
               </w:rPr>
               <w:t>R², RMSE, MAE, Variable Importance in Projection (VIP)</w:t>
             </w:r>
@@ -2494,22 +2910,22 @@
         </w:tc>
         <w:tc>
           <w:tcPr>
-            <w:tcW w:type="dxa" w:w="882"/>
-            <w:vAlign w:val="top"/>
+            <w:tcW w:w="882" w:type="dxa"/>
           </w:tcPr>
           <w:p>
             <w:pPr>
               <w:spacing w:before="40" w:after="40" w:line="252" w:lineRule="auto"/>
               <w:jc w:val="left"/>
-            </w:pPr>
-            <w:r/>
-            <w:r>
-              <w:rPr>
-                <w:rFonts w:ascii="Times New Roman" w:hAnsi="Times New Roman"/>
-                <w:b w:val="0"/>
-                <w:i w:val="0"/>
-                <w:color w:val="000000"/>
-                <w:sz w:val="17"/>
+              <w:rPr>
+                <w:sz w:val="16"/>
+                <w:szCs w:val="16"/>
+              </w:rPr>
+            </w:pPr>
+            <w:r>
+              <w:rPr>
+                <w:color w:val="000000"/>
+                <w:sz w:val="16"/>
+                <w:szCs w:val="16"/>
               </w:rPr>
               <w:t>XGBoost mengidentifikasi screen time, tingkat stres, dan konsumsi kafein sebagai prediktor utama kualitas tidur (R² = 0,782, RMSE = 0,412).</w:t>
             </w:r>
@@ -2517,22 +2933,22 @@
         </w:tc>
         <w:tc>
           <w:tcPr>
-            <w:tcW w:type="dxa" w:w="882"/>
-            <w:vAlign w:val="top"/>
+            <w:tcW w:w="882" w:type="dxa"/>
           </w:tcPr>
           <w:p>
             <w:pPr>
               <w:spacing w:before="40" w:after="40" w:line="252" w:lineRule="auto"/>
               <w:jc w:val="left"/>
-            </w:pPr>
-            <w:r/>
-            <w:r>
-              <w:rPr>
-                <w:rFonts w:ascii="Times New Roman" w:hAnsi="Times New Roman"/>
-                <w:b w:val="0"/>
-                <w:i w:val="0"/>
-                <w:color w:val="000000"/>
-                <w:sz w:val="17"/>
+              <w:rPr>
+                <w:sz w:val="16"/>
+                <w:szCs w:val="16"/>
+              </w:rPr>
+            </w:pPr>
+            <w:r>
+              <w:rPr>
+                <w:color w:val="000000"/>
+                <w:sz w:val="16"/>
+                <w:szCs w:val="16"/>
               </w:rPr>
               <w:t>One-hot encoding pada data kategori memecah fitur menjadi variabel dummy, memicu fragmentasi interpretasi; rekomendasi hanya bersifat umum tanpa takaran target perubahan kebiasaan yang terukur.</w:t>
             </w:r>
@@ -2540,22 +2956,22 @@
         </w:tc>
         <w:tc>
           <w:tcPr>
-            <w:tcW w:type="dxa" w:w="882"/>
-            <w:vAlign w:val="top"/>
+            <w:tcW w:w="882" w:type="dxa"/>
           </w:tcPr>
           <w:p>
             <w:pPr>
               <w:spacing w:before="40" w:after="40" w:line="252" w:lineRule="auto"/>
               <w:jc w:val="left"/>
-            </w:pPr>
-            <w:r/>
-            <w:r>
-              <w:rPr>
-                <w:rFonts w:ascii="Times New Roman" w:hAnsi="Times New Roman"/>
-                <w:b w:val="0"/>
-                <w:i w:val="0"/>
-                <w:color w:val="000000"/>
-                <w:sz w:val="17"/>
+              <w:rPr>
+                <w:sz w:val="16"/>
+                <w:szCs w:val="16"/>
+              </w:rPr>
+            </w:pPr>
+            <w:r>
+              <w:rPr>
+                <w:color w:val="000000"/>
+                <w:sz w:val="16"/>
+                <w:szCs w:val="16"/>
               </w:rPr>
               <w:t>Menghindari fragmentasi variabel dengan penanganan native CatBoost dan memetakan nilai SHAP langsung menjadi target intervensi perilaku kuantitatif (personalized actionable targets) seperti batas menit main HP dan cut-off kafein.</w:t>
             </w:r>
@@ -2565,22 +2981,22 @@
       <w:tr>
         <w:tc>
           <w:tcPr>
-            <w:tcW w:type="dxa" w:w="882"/>
-            <w:vAlign w:val="top"/>
+            <w:tcW w:w="882" w:type="dxa"/>
           </w:tcPr>
           <w:p>
             <w:pPr>
               <w:spacing w:before="40" w:after="40" w:line="252" w:lineRule="auto"/>
               <w:jc w:val="center"/>
-            </w:pPr>
-            <w:r/>
-            <w:r>
-              <w:rPr>
-                <w:rFonts w:ascii="Times New Roman" w:hAnsi="Times New Roman"/>
-                <w:b w:val="0"/>
-                <w:i w:val="0"/>
-                <w:color w:val="000000"/>
-                <w:sz w:val="17"/>
+              <w:rPr>
+                <w:sz w:val="16"/>
+                <w:szCs w:val="16"/>
+              </w:rPr>
+            </w:pPr>
+            <w:r>
+              <w:rPr>
+                <w:color w:val="000000"/>
+                <w:sz w:val="16"/>
+                <w:szCs w:val="16"/>
               </w:rPr>
               <w:t>5</w:t>
             </w:r>
@@ -2588,22 +3004,23 @@
         </w:tc>
         <w:tc>
           <w:tcPr>
-            <w:tcW w:type="dxa" w:w="882"/>
-            <w:vAlign w:val="top"/>
+            <w:tcW w:w="882" w:type="dxa"/>
           </w:tcPr>
           <w:p>
             <w:pPr>
               <w:spacing w:before="40" w:after="40" w:line="252" w:lineRule="auto"/>
               <w:jc w:val="left"/>
-            </w:pPr>
-            <w:r/>
-            <w:r>
-              <w:rPr>
-                <w:rFonts w:ascii="Times New Roman" w:hAnsi="Times New Roman"/>
+              <w:rPr>
+                <w:sz w:val="16"/>
+                <w:szCs w:val="16"/>
+              </w:rPr>
+            </w:pPr>
+            <w:r>
+              <w:rPr>
                 <w:b/>
-                <w:i w:val="0"/>
-                <w:color w:val="000000"/>
-                <w:sz w:val="17"/>
+                <w:color w:val="000000"/>
+                <w:sz w:val="16"/>
+                <w:szCs w:val="16"/>
               </w:rPr>
               <w:t>Das et al. (2025)</w:t>
             </w:r>
@@ -2611,22 +3028,23 @@
         </w:tc>
         <w:tc>
           <w:tcPr>
-            <w:tcW w:type="dxa" w:w="882"/>
-            <w:vAlign w:val="top"/>
+            <w:tcW w:w="882" w:type="dxa"/>
           </w:tcPr>
           <w:p>
             <w:pPr>
               <w:spacing w:before="40" w:after="40" w:line="252" w:lineRule="auto"/>
               <w:jc w:val="left"/>
-            </w:pPr>
-            <w:r/>
-            <w:r>
-              <w:rPr>
-                <w:rFonts w:ascii="Times New Roman" w:hAnsi="Times New Roman"/>
-                <w:b w:val="0"/>
+              <w:rPr>
+                <w:sz w:val="16"/>
+                <w:szCs w:val="16"/>
+              </w:rPr>
+            </w:pPr>
+            <w:r>
+              <w:rPr>
                 <w:i/>
                 <w:color w:val="000000"/>
-                <w:sz w:val="17"/>
+                <w:sz w:val="16"/>
+                <w:szCs w:val="16"/>
               </w:rPr>
               <w:t>Prevalence and Factors Associated with Insomnia Among Chronic Disease Patients in Bangladesh: A Machine Learning Study</w:t>
             </w:r>
@@ -2634,22 +3052,22 @@
         </w:tc>
         <w:tc>
           <w:tcPr>
-            <w:tcW w:type="dxa" w:w="882"/>
-            <w:vAlign w:val="top"/>
+            <w:tcW w:w="882" w:type="dxa"/>
           </w:tcPr>
           <w:p>
             <w:pPr>
               <w:spacing w:before="40" w:after="40" w:line="252" w:lineRule="auto"/>
               <w:jc w:val="left"/>
-            </w:pPr>
-            <w:r/>
-            <w:r>
-              <w:rPr>
-                <w:rFonts w:ascii="Times New Roman" w:hAnsi="Times New Roman"/>
-                <w:b w:val="0"/>
-                <w:i w:val="0"/>
-                <w:color w:val="000000"/>
-                <w:sz w:val="17"/>
+              <w:rPr>
+                <w:sz w:val="16"/>
+                <w:szCs w:val="16"/>
+              </w:rPr>
+            </w:pPr>
+            <w:r>
+              <w:rPr>
+                <w:color w:val="000000"/>
+                <w:sz w:val="16"/>
+                <w:szCs w:val="16"/>
               </w:rPr>
               <w:t>Data survei klinis 1.222 pasien penyakit kronis di Bangladesh</w:t>
             </w:r>
@@ -2657,22 +3075,22 @@
         </w:tc>
         <w:tc>
           <w:tcPr>
-            <w:tcW w:type="dxa" w:w="882"/>
-            <w:vAlign w:val="top"/>
+            <w:tcW w:w="882" w:type="dxa"/>
           </w:tcPr>
           <w:p>
             <w:pPr>
               <w:spacing w:before="40" w:after="40" w:line="252" w:lineRule="auto"/>
               <w:jc w:val="left"/>
-            </w:pPr>
-            <w:r/>
-            <w:r>
-              <w:rPr>
-                <w:rFonts w:ascii="Times New Roman" w:hAnsi="Times New Roman"/>
-                <w:b w:val="0"/>
-                <w:i w:val="0"/>
-                <w:color w:val="000000"/>
-                <w:sz w:val="17"/>
+              <w:rPr>
+                <w:sz w:val="16"/>
+                <w:szCs w:val="16"/>
+              </w:rPr>
+            </w:pPr>
+            <w:r>
+              <w:rPr>
+                <w:color w:val="000000"/>
+                <w:sz w:val="16"/>
+                <w:szCs w:val="16"/>
               </w:rPr>
               <w:t>KNN, Random Forest, SVM, GBM, XGBoost, dan CatBoost</w:t>
             </w:r>
@@ -2680,22 +3098,22 @@
         </w:tc>
         <w:tc>
           <w:tcPr>
-            <w:tcW w:type="dxa" w:w="882"/>
-            <w:vAlign w:val="top"/>
+            <w:tcW w:w="882" w:type="dxa"/>
           </w:tcPr>
           <w:p>
             <w:pPr>
               <w:spacing w:before="40" w:after="40" w:line="252" w:lineRule="auto"/>
               <w:jc w:val="left"/>
-            </w:pPr>
-            <w:r/>
-            <w:r>
-              <w:rPr>
-                <w:rFonts w:ascii="Times New Roman" w:hAnsi="Times New Roman"/>
-                <w:b w:val="0"/>
-                <w:i w:val="0"/>
-                <w:color w:val="000000"/>
-                <w:sz w:val="17"/>
+              <w:rPr>
+                <w:sz w:val="16"/>
+                <w:szCs w:val="16"/>
+              </w:rPr>
+            </w:pPr>
+            <w:r>
+              <w:rPr>
+                <w:color w:val="000000"/>
+                <w:sz w:val="16"/>
+                <w:szCs w:val="16"/>
               </w:rPr>
               <w:t>Akurasi, Precision, Recall, F1-Score, AUC-ROC</w:t>
             </w:r>
@@ -2703,22 +3121,22 @@
         </w:tc>
         <w:tc>
           <w:tcPr>
-            <w:tcW w:type="dxa" w:w="882"/>
-            <w:vAlign w:val="top"/>
+            <w:tcW w:w="882" w:type="dxa"/>
           </w:tcPr>
           <w:p>
             <w:pPr>
               <w:spacing w:before="40" w:after="40" w:line="252" w:lineRule="auto"/>
               <w:jc w:val="left"/>
-            </w:pPr>
-            <w:r/>
-            <w:r>
-              <w:rPr>
-                <w:rFonts w:ascii="Times New Roman" w:hAnsi="Times New Roman"/>
-                <w:b w:val="0"/>
-                <w:i w:val="0"/>
-                <w:color w:val="000000"/>
-                <w:sz w:val="17"/>
+              <w:rPr>
+                <w:sz w:val="16"/>
+                <w:szCs w:val="16"/>
+              </w:rPr>
+            </w:pPr>
+            <w:r>
+              <w:rPr>
+                <w:color w:val="000000"/>
+                <w:sz w:val="16"/>
+                <w:szCs w:val="16"/>
               </w:rPr>
               <w:t>CatBoost meraih performa tertinggi di antara seluruh model: Akurasi 71,67%, F1-Score 71,23%, dan AUC-ROC 77,27%.</w:t>
             </w:r>
@@ -2726,45 +3144,63 @@
         </w:tc>
         <w:tc>
           <w:tcPr>
-            <w:tcW w:type="dxa" w:w="882"/>
-            <w:vAlign w:val="top"/>
+            <w:tcW w:w="882" w:type="dxa"/>
           </w:tcPr>
           <w:p>
             <w:pPr>
               <w:spacing w:before="40" w:after="40" w:line="252" w:lineRule="auto"/>
               <w:jc w:val="left"/>
-            </w:pPr>
-            <w:r/>
-            <w:r>
-              <w:rPr>
-                <w:rFonts w:ascii="Times New Roman" w:hAnsi="Times New Roman"/>
-                <w:b w:val="0"/>
-                <w:i w:val="0"/>
-                <w:color w:val="000000"/>
-                <w:sz w:val="17"/>
-              </w:rPr>
-              <w:t>Target klasifikasi terbatas biner sederhana (Insomnia vs Non-Insomnia); sampel terbatas pada pasien penyakit kronis; evaluasi SHAP hanya beeswarm global; tidak diimplementasikan ke dalam prototipe CDSS interaktif.</w:t>
-            </w:r>
-          </w:p>
-        </w:tc>
-        <w:tc>
-          <w:tcPr>
-            <w:tcW w:type="dxa" w:w="882"/>
-            <w:vAlign w:val="top"/>
+              <w:rPr>
+                <w:sz w:val="16"/>
+                <w:szCs w:val="16"/>
+              </w:rPr>
+            </w:pPr>
+            <w:r>
+              <w:rPr>
+                <w:color w:val="000000"/>
+                <w:sz w:val="16"/>
+                <w:szCs w:val="16"/>
+              </w:rPr>
+              <w:t xml:space="preserve">Target klasifikasi terbatas biner sederhana (Insomnia vs </w:t>
+            </w:r>
+            <w:proofErr w:type="gramStart"/>
+            <w:r>
+              <w:rPr>
+                <w:color w:val="000000"/>
+                <w:sz w:val="16"/>
+                <w:szCs w:val="16"/>
+              </w:rPr>
+              <w:t>Non-Insomnia</w:t>
+            </w:r>
+            <w:proofErr w:type="gramEnd"/>
+            <w:r>
+              <w:rPr>
+                <w:color w:val="000000"/>
+                <w:sz w:val="16"/>
+                <w:szCs w:val="16"/>
+              </w:rPr>
+              <w:t>); sampel terbatas pada pasien penyakit kronis; evaluasi SHAP hanya beeswarm global; tidak diimplementasikan ke dalam prototipe CDSS interaktif.</w:t>
+            </w:r>
+          </w:p>
+        </w:tc>
+        <w:tc>
+          <w:tcPr>
+            <w:tcW w:w="882" w:type="dxa"/>
           </w:tcPr>
           <w:p>
             <w:pPr>
               <w:spacing w:before="40" w:after="40" w:line="252" w:lineRule="auto"/>
               <w:jc w:val="left"/>
-            </w:pPr>
-            <w:r/>
-            <w:r>
-              <w:rPr>
-                <w:rFonts w:ascii="Times New Roman" w:hAnsi="Times New Roman"/>
-                <w:b w:val="0"/>
-                <w:i w:val="0"/>
-                <w:color w:val="000000"/>
-                <w:sz w:val="17"/>
+              <w:rPr>
+                <w:sz w:val="16"/>
+                <w:szCs w:val="16"/>
+              </w:rPr>
+            </w:pPr>
+            <w:r>
+              <w:rPr>
+                <w:color w:val="000000"/>
+                <w:sz w:val="16"/>
+                <w:szCs w:val="16"/>
               </w:rPr>
               <w:t>Mengklasifikasikan 4 tingkatan keparahan risiko secara bertingkat (Healthy, Mild, Moderate, Severe), pada populasi umum gaya hidup digital 100.000 instans, dilengkapi penjelasan lokal individual dan purwarupa sistem CDSS interaktif dengan simulasi What-If.</w:t>
             </w:r>
@@ -2774,22 +3210,22 @@
       <w:tr>
         <w:tc>
           <w:tcPr>
-            <w:tcW w:type="dxa" w:w="882"/>
-            <w:vAlign w:val="top"/>
+            <w:tcW w:w="882" w:type="dxa"/>
           </w:tcPr>
           <w:p>
             <w:pPr>
               <w:spacing w:before="40" w:after="40" w:line="252" w:lineRule="auto"/>
               <w:jc w:val="center"/>
-            </w:pPr>
-            <w:r/>
-            <w:r>
-              <w:rPr>
-                <w:rFonts w:ascii="Times New Roman" w:hAnsi="Times New Roman"/>
-                <w:b w:val="0"/>
-                <w:i w:val="0"/>
-                <w:color w:val="000000"/>
-                <w:sz w:val="17"/>
+              <w:rPr>
+                <w:sz w:val="16"/>
+                <w:szCs w:val="16"/>
+              </w:rPr>
+            </w:pPr>
+            <w:r>
+              <w:rPr>
+                <w:color w:val="000000"/>
+                <w:sz w:val="16"/>
+                <w:szCs w:val="16"/>
               </w:rPr>
               <w:t>6</w:t>
             </w:r>
@@ -2797,22 +3233,23 @@
         </w:tc>
         <w:tc>
           <w:tcPr>
-            <w:tcW w:type="dxa" w:w="882"/>
-            <w:vAlign w:val="top"/>
+            <w:tcW w:w="882" w:type="dxa"/>
           </w:tcPr>
           <w:p>
             <w:pPr>
               <w:spacing w:before="40" w:after="40" w:line="252" w:lineRule="auto"/>
               <w:jc w:val="left"/>
-            </w:pPr>
-            <w:r/>
-            <w:r>
-              <w:rPr>
-                <w:rFonts w:ascii="Times New Roman" w:hAnsi="Times New Roman"/>
+              <w:rPr>
+                <w:sz w:val="16"/>
+                <w:szCs w:val="16"/>
+              </w:rPr>
+            </w:pPr>
+            <w:r>
+              <w:rPr>
                 <w:b/>
-                <w:i w:val="0"/>
-                <w:color w:val="000000"/>
-                <w:sz w:val="17"/>
+                <w:color w:val="000000"/>
+                <w:sz w:val="16"/>
+                <w:szCs w:val="16"/>
               </w:rPr>
               <w:t>Srinivasu et al. (2024)</w:t>
             </w:r>
@@ -2820,22 +3257,23 @@
         </w:tc>
         <w:tc>
           <w:tcPr>
-            <w:tcW w:type="dxa" w:w="882"/>
-            <w:vAlign w:val="top"/>
+            <w:tcW w:w="882" w:type="dxa"/>
           </w:tcPr>
           <w:p>
             <w:pPr>
               <w:spacing w:before="40" w:after="40" w:line="252" w:lineRule="auto"/>
               <w:jc w:val="left"/>
-            </w:pPr>
-            <w:r/>
-            <w:r>
-              <w:rPr>
-                <w:rFonts w:ascii="Times New Roman" w:hAnsi="Times New Roman"/>
-                <w:b w:val="0"/>
+              <w:rPr>
+                <w:sz w:val="16"/>
+                <w:szCs w:val="16"/>
+              </w:rPr>
+            </w:pPr>
+            <w:r>
+              <w:rPr>
                 <w:i/>
                 <w:color w:val="000000"/>
-                <w:sz w:val="17"/>
+                <w:sz w:val="16"/>
+                <w:szCs w:val="16"/>
               </w:rPr>
               <w:t>XAI-Driven CatBoost Multi-Layer Perceptron Neural Network for Analyzing Breast Cancer</w:t>
             </w:r>
@@ -2843,22 +3281,22 @@
         </w:tc>
         <w:tc>
           <w:tcPr>
-            <w:tcW w:type="dxa" w:w="882"/>
-            <w:vAlign w:val="top"/>
+            <w:tcW w:w="882" w:type="dxa"/>
           </w:tcPr>
           <w:p>
             <w:pPr>
               <w:spacing w:before="40" w:after="40" w:line="252" w:lineRule="auto"/>
               <w:jc w:val="left"/>
-            </w:pPr>
-            <w:r/>
-            <w:r>
-              <w:rPr>
-                <w:rFonts w:ascii="Times New Roman" w:hAnsi="Times New Roman"/>
-                <w:b w:val="0"/>
-                <w:i w:val="0"/>
-                <w:color w:val="000000"/>
-                <w:sz w:val="17"/>
+              <w:rPr>
+                <w:sz w:val="16"/>
+                <w:szCs w:val="16"/>
+              </w:rPr>
+            </w:pPr>
+            <w:r>
+              <w:rPr>
+                <w:color w:val="000000"/>
+                <w:sz w:val="16"/>
+                <w:szCs w:val="16"/>
               </w:rPr>
               <w:t>Breast Cancer Wisconsin Diagnostic Dataset (WDBC) (569 instans, 30 fitur laboratorium)</w:t>
             </w:r>
@@ -2866,22 +3304,22 @@
         </w:tc>
         <w:tc>
           <w:tcPr>
-            <w:tcW w:type="dxa" w:w="882"/>
-            <w:vAlign w:val="top"/>
+            <w:tcW w:w="882" w:type="dxa"/>
           </w:tcPr>
           <w:p>
             <w:pPr>
               <w:spacing w:before="40" w:after="40" w:line="252" w:lineRule="auto"/>
               <w:jc w:val="left"/>
-            </w:pPr>
-            <w:r/>
-            <w:r>
-              <w:rPr>
-                <w:rFonts w:ascii="Times New Roman" w:hAnsi="Times New Roman"/>
-                <w:b w:val="0"/>
-                <w:i w:val="0"/>
-                <w:color w:val="000000"/>
-                <w:sz w:val="17"/>
+              <w:rPr>
+                <w:sz w:val="16"/>
+                <w:szCs w:val="16"/>
+              </w:rPr>
+            </w:pPr>
+            <w:r>
+              <w:rPr>
+                <w:color w:val="000000"/>
+                <w:sz w:val="16"/>
+                <w:szCs w:val="16"/>
               </w:rPr>
               <w:t>Hybrid CatBoost + Multi-Layer Perceptron (MLP) dengan seleksi fitur ANOVA dan Tree-SHAP</w:t>
             </w:r>
@@ -2889,22 +3327,22 @@
         </w:tc>
         <w:tc>
           <w:tcPr>
-            <w:tcW w:type="dxa" w:w="882"/>
-            <w:vAlign w:val="top"/>
+            <w:tcW w:w="882" w:type="dxa"/>
           </w:tcPr>
           <w:p>
             <w:pPr>
               <w:spacing w:before="40" w:after="40" w:line="252" w:lineRule="auto"/>
               <w:jc w:val="left"/>
-            </w:pPr>
-            <w:r/>
-            <w:r>
-              <w:rPr>
-                <w:rFonts w:ascii="Times New Roman" w:hAnsi="Times New Roman"/>
-                <w:b w:val="0"/>
-                <w:i w:val="0"/>
-                <w:color w:val="000000"/>
-                <w:sz w:val="17"/>
+              <w:rPr>
+                <w:sz w:val="16"/>
+                <w:szCs w:val="16"/>
+              </w:rPr>
+            </w:pPr>
+            <w:r>
+              <w:rPr>
+                <w:color w:val="000000"/>
+                <w:sz w:val="16"/>
+                <w:szCs w:val="16"/>
               </w:rPr>
               <w:t>Akurasi, Precision, Recall, F1-Score, Specificity</w:t>
             </w:r>
@@ -2912,22 +3350,22 @@
         </w:tc>
         <w:tc>
           <w:tcPr>
-            <w:tcW w:type="dxa" w:w="882"/>
-            <w:vAlign w:val="top"/>
+            <w:tcW w:w="882" w:type="dxa"/>
           </w:tcPr>
           <w:p>
             <w:pPr>
               <w:spacing w:before="40" w:after="40" w:line="252" w:lineRule="auto"/>
               <w:jc w:val="left"/>
-            </w:pPr>
-            <w:r/>
-            <w:r>
-              <w:rPr>
-                <w:rFonts w:ascii="Times New Roman" w:hAnsi="Times New Roman"/>
-                <w:b w:val="0"/>
-                <w:i w:val="0"/>
-                <w:color w:val="000000"/>
-                <w:sz w:val="17"/>
+              <w:rPr>
+                <w:sz w:val="16"/>
+                <w:szCs w:val="16"/>
+              </w:rPr>
+            </w:pPr>
+            <w:r>
+              <w:rPr>
+                <w:color w:val="000000"/>
+                <w:sz w:val="16"/>
+                <w:szCs w:val="16"/>
               </w:rPr>
               <w:t>Mencapai Akurasi 99,30%, Precision 99,20%, Recall 99,40%, F1-Score 99,30%.</w:t>
             </w:r>
@@ -2935,22 +3373,22 @@
         </w:tc>
         <w:tc>
           <w:tcPr>
-            <w:tcW w:type="dxa" w:w="882"/>
-            <w:vAlign w:val="top"/>
+            <w:tcW w:w="882" w:type="dxa"/>
           </w:tcPr>
           <w:p>
             <w:pPr>
               <w:spacing w:before="40" w:after="40" w:line="252" w:lineRule="auto"/>
               <w:jc w:val="left"/>
-            </w:pPr>
-            <w:r/>
-            <w:r>
-              <w:rPr>
-                <w:rFonts w:ascii="Times New Roman" w:hAnsi="Times New Roman"/>
-                <w:b w:val="0"/>
-                <w:i w:val="0"/>
-                <w:color w:val="000000"/>
-                <w:sz w:val="17"/>
+              <w:rPr>
+                <w:sz w:val="16"/>
+                <w:szCs w:val="16"/>
+              </w:rPr>
+            </w:pPr>
+            <w:r>
+              <w:rPr>
+                <w:color w:val="000000"/>
+                <w:sz w:val="16"/>
+                <w:szCs w:val="16"/>
               </w:rPr>
               <w:t>Diterapkan pada data laboratorium patologis onkologi dengan parameter fisik yang tidak dapat diubah (non-modifiable biological attributes); belum mengintegrasikan modul simulasi perubahan perilaku pasien.</w:t>
             </w:r>
@@ -2958,22 +3396,22 @@
         </w:tc>
         <w:tc>
           <w:tcPr>
-            <w:tcW w:type="dxa" w:w="882"/>
-            <w:vAlign w:val="top"/>
+            <w:tcW w:w="882" w:type="dxa"/>
           </w:tcPr>
           <w:p>
             <w:pPr>
               <w:spacing w:before="40" w:after="40" w:line="252" w:lineRule="auto"/>
               <w:jc w:val="left"/>
-            </w:pPr>
-            <w:r/>
-            <w:r>
-              <w:rPr>
-                <w:rFonts w:ascii="Times New Roman" w:hAnsi="Times New Roman"/>
-                <w:b w:val="0"/>
-                <w:i w:val="0"/>
-                <w:color w:val="000000"/>
-                <w:sz w:val="17"/>
+              <w:rPr>
+                <w:sz w:val="16"/>
+                <w:szCs w:val="16"/>
+              </w:rPr>
+            </w:pPr>
+            <w:r>
+              <w:rPr>
+                <w:color w:val="000000"/>
+                <w:sz w:val="16"/>
+                <w:szCs w:val="16"/>
               </w:rPr>
               <w:t>Mengadaptasi metodologi CatBoost dan SHAP ke ranah metrik perilaku gaya hidup digital yang modifiable, memungkinkan pengguna menguji perubahan kebiasaan secara simulatif pada antarmuka CDSS.</w:t>
             </w:r>
@@ -2983,17 +3421,10 @@
     </w:tbl>
     <w:p>
       <w:pPr>
-        <w:spacing w:after="0"/>
-        <w:rPr>
-          <w:rFonts w:cs="Times New Roman"/>
-        </w:rPr>
-      </w:pPr>
-    </w:p>
-    <w:p>
-      <w:pPr>
         <w:pStyle w:val="Heading2"/>
       </w:pPr>
       <w:r>
+        <w:lastRenderedPageBreak/>
         <w:t>2.3 Kerangka Berpikir</w:t>
       </w:r>
     </w:p>
@@ -3060,6 +3491,23 @@
     </w:p>
     <w:p>
       <w:pPr>
+        <w:spacing w:before="80" w:after="120" w:line="276" w:lineRule="auto"/>
+        <w:jc w:val="center"/>
+      </w:pPr>
+      <w:r/>
+      <w:r>
+        <w:rPr>
+          <w:rFonts w:ascii="Times New Roman" w:hAnsi="Times New Roman"/>
+          <w:b/>
+          <w:i w:val="0"/>
+          <w:color w:val="000000"/>
+          <w:sz w:val="21"/>
+        </w:rPr>
+        <w:t>Gambar 2.1 Bagan Kerangka Berpikir Integrasi CatBoost dan Tree-SHAP untuk Deteksi Risiko Gangguan Tidur</w:t>
+      </w:r>
+    </w:p>
+    <w:p>
+      <w:pPr>
         <w:spacing w:after="0"/>
         <w:rPr>
           <w:rFonts w:cs="Times New Roman"/>
@@ -3069,14 +3517,20 @@
         <w:rPr>
           <w:rFonts w:cs="Times New Roman"/>
         </w:rPr>
+        <w:tab/>
+      </w:r>
+      <w:r>
+        <w:rPr>
+          <w:rFonts w:cs="Times New Roman"/>
+        </w:rPr>
+        <w:t xml:space="preserve">Kerangka berpikir dalam penelitian ini dibangun secara runtut untuk menyelesaikan dilema antara tingginya akurasi komputasi dengan tuntutan transparansi klinis dalam deteksi gangguan tidur. Titik tolak masalah berakar dari </w:t>
+      </w:r>
+      <w:r>
+        <w:rPr>
+          <w:rFonts w:cs="Times New Roman"/>
+        </w:rPr>
         <w:lastRenderedPageBreak/>
-        <w:tab/>
-      </w:r>
-      <w:r>
-        <w:rPr>
-          <w:rFonts w:cs="Times New Roman"/>
-        </w:rPr>
-        <w:t xml:space="preserve">Kerangka berpikir dalam penelitian ini dibangun secara runtut untuk menyelesaikan dilema antara tingginya akurasi komputasi dengan tuntutan transparansi klinis dalam deteksi gangguan tidur. Titik tolak masalah berakar dari meluasnya penurunan kualitas tidur akibat kebiasaan gaya hidup digital seperti </w:t>
+        <w:t xml:space="preserve">meluasnya penurunan kualitas tidur akibat kebiasaan gaya hidup digital seperti </w:t>
       </w:r>
       <w:r>
         <w:rPr>
@@ -11795,16 +12249,19 @@
     </w:p>
     <w:p>
       <w:pPr>
-        <w:spacing w:before="40" w:after="240"/>
+        <w:spacing w:before="80" w:after="120" w:line="276" w:lineRule="auto"/>
         <w:jc w:val="center"/>
       </w:pPr>
-      <w:r>
-        <w:rPr>
+      <w:r/>
+      <w:r>
+        <w:rPr>
+          <w:rFonts w:ascii="Times New Roman" w:hAnsi="Times New Roman"/>
           <w:b/>
+          <w:i w:val="0"/>
           <w:color w:val="000000"/>
           <w:sz w:val="21"/>
         </w:rPr>
-        <w:t>Grafik Sebaran Ketidakseimbangan Kelas Target (Dataset 100.000 Baris)</w:t>
+        <w:t>Gambar 3.2 Grafik Sebaran Ketidakseimbangan Kelas Target (Dataset 100.000 Baris)</w:t>
       </w:r>
     </w:p>
     <w:p>
@@ -15623,15 +16080,19 @@
     </w:p>
     <w:p>
       <w:pPr>
-        <w:spacing w:before="40" w:after="80" w:line="240" w:lineRule="auto"/>
+        <w:spacing w:before="80" w:after="120" w:line="276" w:lineRule="auto"/>
         <w:jc w:val="center"/>
       </w:pPr>
-      <w:r>
-        <w:rPr>
+      <w:r/>
+      <w:r>
+        <w:rPr>
+          <w:rFonts w:ascii="Times New Roman" w:hAnsi="Times New Roman"/>
           <w:b/>
-          <w:sz w:val="22"/>
-        </w:rPr>
-        <w:t>Gambar 3.2 Diagram Alir Simulasi Perhitungan Matematis Manual (Toy Example Workflow) pada Algoritma CatBoost dan XAI-SHAP</w:t>
+          <w:i w:val="0"/>
+          <w:color w:val="000000"/>
+          <w:sz w:val="21"/>
+        </w:rPr>
+        <w:t>Gambar 3.3 Diagram Alir Simulasi Perhitungan Matematis Manual (Toy Example Workflow) pada Algoritma CatBoost dan XAI-SHAP</w:t>
       </w:r>
     </w:p>
     <w:p>
@@ -15682,16 +16143,19 @@
     </w:p>
     <w:p>
       <w:pPr>
-        <w:spacing w:before="40" w:after="80" w:line="240" w:lineRule="auto"/>
+        <w:spacing w:before="80" w:after="120" w:line="276" w:lineRule="auto"/>
         <w:jc w:val="center"/>
       </w:pPr>
-      <w:r>
-        <w:rPr>
+      <w:r/>
+      <w:r>
+        <w:rPr>
+          <w:rFonts w:ascii="Times New Roman" w:hAnsi="Times New Roman"/>
           <w:b/>
-          <w:sz w:val="22"/>
-        </w:rPr>
-        <w:lastRenderedPageBreak/>
-        <w:t>Gambar 3.3 Visualisasi Bobot Penalti Kelas dan Simulasi Matriks Kebingungan (Confusion Matrix) 4x4</w:t>
+          <w:i w:val="0"/>
+          <w:color w:val="000000"/>
+          <w:sz w:val="21"/>
+        </w:rPr>
+        <w:t>Gambar 3.4 Visualisasi Bobot Penalti Kelas dan Simulasi Matriks Kebingungan (Confusion Matrix) 4x4</w:t>
       </w:r>
     </w:p>
     <w:p>
@@ -19260,15 +19724,19 @@
     </w:p>
     <w:p>
       <w:pPr>
-        <w:spacing w:before="40" w:after="80" w:line="240" w:lineRule="auto"/>
+        <w:spacing w:before="80" w:after="120" w:line="276" w:lineRule="auto"/>
         <w:jc w:val="center"/>
       </w:pPr>
-      <w:r>
-        <w:rPr>
+      <w:r/>
+      <w:r>
+        <w:rPr>
+          <w:rFonts w:ascii="Times New Roman" w:hAnsi="Times New Roman"/>
           <w:b/>
-          <w:sz w:val="22"/>
-        </w:rPr>
-        <w:t>Gambar 3.4 Alur Komputasi dan Interpretasi XAI Tree-SHAP</w:t>
+          <w:i w:val="0"/>
+          <w:color w:val="000000"/>
+          <w:sz w:val="21"/>
+        </w:rPr>
+        <w:t>Gambar 3.5 Alur Komputasi dan Interpretasi XAI Tree-SHAP</w:t>
       </w:r>
     </w:p>
     <w:p>
@@ -19340,7 +19808,7 @@
     </w:p>
     <w:p>
       <w:pPr>
-        <w:spacing w:before="40" w:after="80" w:line="240" w:lineRule="auto"/>
+        <w:spacing w:before="80" w:after="120" w:line="276" w:lineRule="auto"/>
         <w:jc w:val="center"/>
         <w:rPr>
           <w:b/>
@@ -19348,12 +19816,16 @@
           <w:sz w:val="21"/>
         </w:rPr>
       </w:pPr>
-      <w:r>
-        <w:rPr>
+      <w:r/>
+      <w:r>
+        <w:rPr>
+          <w:rFonts w:ascii="Times New Roman" w:hAnsi="Times New Roman"/>
           <w:b/>
-          <w:sz w:val="22"/>
-        </w:rPr>
-        <w:t>Gambar 3.5 Mockup Antarmuka Prototipe Web CDSS Analisis Gangguan Tidur Berbasis CatBoost-SHAP</w:t>
+          <w:i w:val="0"/>
+          <w:color w:val="000000"/>
+          <w:sz w:val="21"/>
+        </w:rPr>
+        <w:t>Gambar 3.6 Mockup Antarmuka Prototipe Web CDSS Analisis Gangguan Tidur Berbasis CatBoost-SHAP</w:t>
       </w:r>
     </w:p>
     <w:p>
@@ -19398,19 +19870,7 @@
           <w:rPr>
             <w:rStyle w:val="Hyperlink"/>
           </w:rPr>
-          <w:t>https://doi.org/10.1186/s1</w:t>
-        </w:r>
-        <w:r>
-          <w:rPr>
-            <w:rStyle w:val="Hyperlink"/>
-          </w:rPr>
-          <w:t>2</w:t>
-        </w:r>
-        <w:r>
-          <w:rPr>
-            <w:rStyle w:val="Hyperlink"/>
-          </w:rPr>
-          <w:t>911-020-01332-6</w:t>
+          <w:t>https://doi.org/10.1186/s12911-020-01332-6</w:t>
         </w:r>
       </w:hyperlink>
     </w:p>
@@ -19428,19 +19888,7 @@
           <w:rPr>
             <w:rStyle w:val="Hyperlink"/>
           </w:rPr>
-          <w:t>https://doi.org/10.</w:t>
-        </w:r>
-        <w:r>
-          <w:rPr>
-            <w:rStyle w:val="Hyperlink"/>
-          </w:rPr>
-          <w:t>1</w:t>
-        </w:r>
-        <w:r>
-          <w:rPr>
-            <w:rStyle w:val="Hyperlink"/>
-          </w:rPr>
-          <w:t>016/j.ejrad.2024.111403</w:t>
+          <w:t>https://doi.org/10.1016/j.ejrad.2024.111403</w:t>
         </w:r>
       </w:hyperlink>
     </w:p>
@@ -19657,19 +20105,7 @@
           <w:rPr>
             <w:rStyle w:val="Hyperlink"/>
           </w:rPr>
-          <w:t>https://doi.org/10.</w:t>
-        </w:r>
-        <w:r>
-          <w:rPr>
-            <w:rStyle w:val="Hyperlink"/>
-          </w:rPr>
-          <w:t>4</w:t>
-        </w:r>
-        <w:r>
-          <w:rPr>
-            <w:rStyle w:val="Hyperlink"/>
-          </w:rPr>
-          <w:t>8550/arXiv.1705.07874</w:t>
+          <w:t>https://doi.org/10.48550/arXiv.1705.07874</w:t>
         </w:r>
       </w:hyperlink>
     </w:p>
@@ -22003,6 +22439,25 @@
       <w:szCs w:val="18"/>
     </w:rPr>
   </w:style>
+  <w:style w:type="table" w:styleId="TableGridLight">
+    <w:name w:val="Grid Table Light"/>
+    <w:basedOn w:val="TableNormal"/>
+    <w:uiPriority w:val="40"/>
+    <w:rsid w:val="00D86A40"/>
+    <w:pPr>
+      <w:spacing w:after="0" w:line="240" w:lineRule="auto"/>
+    </w:pPr>
+    <w:tblPr>
+      <w:tblBorders>
+        <w:top w:val="single" w:sz="4" w:space="0" w:color="BFBFBF" w:themeColor="background1" w:themeShade="BF"/>
+        <w:left w:val="single" w:sz="4" w:space="0" w:color="BFBFBF" w:themeColor="background1" w:themeShade="BF"/>
+        <w:bottom w:val="single" w:sz="4" w:space="0" w:color="BFBFBF" w:themeColor="background1" w:themeShade="BF"/>
+        <w:right w:val="single" w:sz="4" w:space="0" w:color="BFBFBF" w:themeColor="background1" w:themeShade="BF"/>
+        <w:insideH w:val="single" w:sz="4" w:space="0" w:color="BFBFBF" w:themeColor="background1" w:themeShade="BF"/>
+        <w:insideV w:val="single" w:sz="4" w:space="0" w:color="BFBFBF" w:themeColor="background1" w:themeShade="BF"/>
+      </w:tblBorders>
+    </w:tblPr>
+  </w:style>
 </w:styles>
 </file>
 

</xml_diff>